<commit_message>
Revise JMIR manuscript and reviewer response
</commit_message>
<xml_diff>
--- a/manuscript.docx
+++ b/manuscript.docx
@@ -7,7 +7,7 @@
         <w:pStyle w:val="Title"/>
       </w:pPr>
       <w:r>
-        <w:t xml:space="preserve">Large Language Models for Structured Information Extraction in Artificial Intelligence-Assisted Clinical Handover: Evaluation Study</w:t>
+        <w:t xml:space="preserve">Artificial Intelligence–Based Structured Information Extraction From Synthetic Nursing Handover Transcripts: Comparative Evaluation of Large Language Models</w:t>
       </w:r>
     </w:p>
     <w:p>
@@ -136,7 +136,7 @@
         <w:t xml:space="preserve">3</w:t>
       </w:r>
       <w:r>
-        <w:t xml:space="preserve">, Grace Xu</w:t>
+        <w:t xml:space="preserve">, Hui (Grace) Xu</w:t>
       </w:r>
       <w:r>
         <w:rPr>
@@ -366,7 +366,7 @@
         <w:t xml:space="preserve"> </w:t>
       </w:r>
       <w:r>
-        <w:t xml:space="preserve">The Prince Charles Hospital, Brisbane, Australia</w:t>
+        <w:t xml:space="preserve">The Prince Charles Hospital, Metro North Health, Brisbane, Australia</w:t>
       </w:r>
       <w:r>
         <w:br/>
@@ -515,7 +515,7 @@
         <w:pStyle w:val="FirstParagraph"/>
       </w:pPr>
       <w:r>
-        <w:t xml:space="preserve">Artificial intelligence has the potential to improve the reliability and completeness of clinical handover by helping clinicians verify that key information has been communicated, identify explicit information gaps, and prompt clarification before responsibility is transferred.</w:t>
+        <w:t xml:space="preserve">Clinical handover is the process during which responsibility and accountability for care are transferred between clinicians. Artificial intelligence has the potential to improve the reliability and completeness of clinical handover by helping clinicians detect predefined content areas that have been communicated, identify explicit information gaps, and prompt clarification before responsibility is transferred.</w:t>
       </w:r>
       <w:bookmarkEnd w:id="26"/>
     </w:p>
@@ -533,7 +533,7 @@
         <w:pStyle w:val="FirstParagraph"/>
       </w:pPr>
       <w:r>
-        <w:t xml:space="preserve">This study evaluated the performance of several large language models and prompt optimisation strategies for structured information extraction across tasks that could be integrated into AI-assisted clinical handover.</w:t>
+        <w:t xml:space="preserve">This study evaluated the performance of several large language models and prompt optimisation strategies for structured information extraction of synthetic nursing handover transcripts.</w:t>
       </w:r>
       <w:bookmarkEnd w:id="27"/>
     </w:p>
@@ -569,7 +569,7 @@
         <w:pStyle w:val="FirstParagraph"/>
       </w:pPr>
       <w:r>
-        <w:t xml:space="preserve">The GPT-5.2 optimised model achieved micro-F1 0.85 (95% CI 0.83-0.88) for content detection, an absolute improvement of +0.08 compared with the matched baseline. GPT-5-nano also performed strongly after optimisation for content detection (micro-F1 0.81 (95% CI 0.78-0.84)), suggesting that this structured task was not limited to the highest-capacity model. For SBAR span extraction, GPT-5.2 with prompt optimisation achieved micro-F1 0.76 (95% CI 0.72-0.79), improving by +0.24 compared with baseline and exceeding LangExtract; GPT-5-nano also improved to micro-F1 0.69 (95% CI 0.66-0.72). Broad uncertainty-span extraction remained comparatively weak despite prompt optimisation (micro-F1 0.41 (95% CI 0.33-0.48); absolute improvement +0.06). In contrast, explicit unknown-fact extraction was stronger with GPT-5.2 (micro-F1 0.84 (95% CI 0.63-1.00)), GPT-5-nano (micro-F1 0.84 (95% CI 0.63-1.00)), and MedGemma 27B (micro-F1 0.80 (95% CI 0.63-1.00)). Genetic-Pareto optimised prompts outperformed the LangExtract approach across each span-extraction task.</w:t>
+        <w:t xml:space="preserve">The GPT-5.2 optimised model achieved micro-F1 0.85 (95% CI 0.83-0.88) for content detection, an absolute improvement of +0.08 compared with the matched baseline. GPT-5-nano also performed better after optimisation for content detection (micro-F1 0.81 (95% CI 0.78-0.84)), suggesting that this structured task was not limited to the highest-capacity model. For SBAR span extraction, GPT-5.2 with prompt optimisation achieved micro-F1 0.76 (95% CI 0.72-0.79), improving by +0.24 compared with baseline and exceeding LangExtract; GPT-5-nano also improved to micro-F1 0.69 (95% CI 0.66-0.72). Broad uncertainty-span extraction remained comparatively weak despite prompt optimisation (micro-F1 0.41 (95% CI 0.33-0.48); absolute improvement +0.06). In contrast, explicit unknown-fact extraction was more accurate with GPT-5.2 (micro-F1 0.84 (95% CI 0.63-1.00)), GPT-5-nano (micro-F1 0.84 (95% CI 0.63-1.00)), and MedGemma 27B (micro-F1 0.80 (95% CI 0.63-1.00)). Genetic-Pareto optimised prompts outperformed the LangExtract approach across each span-extraction task.</w:t>
       </w:r>
       <w:bookmarkEnd w:id="29"/>
     </w:p>
@@ -587,7 +587,7 @@
         <w:pStyle w:val="FirstParagraph"/>
       </w:pPr>
       <w:r>
-        <w:t xml:space="preserve">Large language models demonstrated sufficient performance to support selected clinical handover tasks, particularly verification of key information and extraction of structured SBAR content. These capabilities could help reduce information omissions and improve the consistency of handover communication when used as clinician-reviewed prompts rather than autonomous summaries. Although broad uncertainty detection remained insufficiently reliable, models performed substantially better at identifying explicit gaps in knowledge. The most useful near-term function may therefore be identifying what has not been said, rather than restructuring what has, by prompting clarification before communication failures contribute to patient harm.</w:t>
+        <w:t xml:space="preserve">Prompt optimisation improved matched-model point estimates, with the highest performance observed for predefined content detection and SBAR span extraction. Broad uncertainty extraction remained less accurate than the narrower unknown-fact task. These technical results do not establish clinical effectiveness, safety, or readiness for real-time use. Validation using authentic nursing handover communication and prospective evaluation in clinical workflows are required before clinical application.</w:t>
       </w:r>
       <w:bookmarkEnd w:id="30"/>
       <w:bookmarkEnd w:id="31"/>
@@ -608,6 +608,11 @@
       <w:r>
         <w:t xml:space="preserve">artificial intelligence; clinical handover; nursing; patient handoff; natural language processing; large language models; prompt engineering; information extraction; patient safety; machine learning</w:t>
       </w:r>
+    </w:p>
+    <w:p>
+      <w:r>
+        <w:br w:type="page"/>
+      </w:r>
       <w:bookmarkEnd w:id="32"/>
     </w:p>
     <w:p>
@@ -624,7 +629,16 @@
         <w:pStyle w:val="FirstParagraph"/>
       </w:pPr>
       <w:r>
-        <w:t xml:space="preserve">Clinical handover is a safety-critical transition in which responsibility and accountability for patient care are transferred between clinicians. Failures in communication that occur at handover through inaccurate, incomplete, or misinterpreted information transfer create opportunities for delays, duplicated work, and preventable harm</w:t>
+        <w:t xml:space="preserve">Clinical handover is the process during which responsibility and accountability for some or all aspects of a patient’s care are transferred to another clinician or clinical team</w:t>
+      </w:r>
+      <w:r>
+        <w:t xml:space="preserve"> </w:t>
+      </w:r>
+      <w:r>
+        <w:t xml:space="preserve">(Australian Commission on Safety and Quality in Health Care 2026)</w:t>
+      </w:r>
+      <w:r>
+        <w:t xml:space="preserve">. In nursing, shift-to-shift and transfer handovers support continuity of surveillance, care priorities, pending actions, and the inclusion of patient and family concerns. Inaccurate, incomplete, or misinterpreted communication at this transition can contribute to delays, duplicated work, and preventable harm</w:t>
       </w:r>
       <w:r>
         <w:t xml:space="preserve"> </w:t>
@@ -633,13 +647,13 @@
         <w:t xml:space="preserve">(Ong and Coiera 2011; Manias et al. 2016)</w:t>
       </w:r>
       <w:r>
-        <w:t xml:space="preserve">. In recognition of this risk, international and national bodies have prioritised structured handover practices and communication redesign as patient-safety interventions, particularly at transitions of care where information loss is more likely</w:t>
-      </w:r>
-      <w:r>
-        <w:t xml:space="preserve"> </w:t>
-      </w:r>
-      <w:r>
-        <w:t xml:space="preserve">(Manser and Foster 2011; Bukoh and Siah 2020)</w:t>
+        <w:t xml:space="preserve">. International and Australian patient-safety standards therefore prioritise structured clinical handover, particularly at shift changes, transfers, and discharge</w:t>
+      </w:r>
+      <w:r>
+        <w:t xml:space="preserve"> </w:t>
+      </w:r>
+      <w:r>
+        <w:t xml:space="preserve">(World Health Organization et al. 2007; Australian Commission on Safety and Quality in Health Care 2026)</w:t>
       </w:r>
       <w:r>
         <w:t xml:space="preserve">.</w:t>
@@ -650,31 +664,31 @@
         <w:pStyle w:val="BodyText"/>
       </w:pPr>
       <w:r>
-        <w:t xml:space="preserve">Structured handover processes aim to standardise both the minimum content and the format of exchange so that critical information is predictably conveyed, acted upon, and auditable. In Australia, the Communicating for Safety Standard emphasises structured clinical handover to reduce communication errors and improve patient safety, explicitly noting the heightened risk at shift changes, transfers, and discharge</w:t>
-      </w:r>
-      <w:r>
-        <w:t xml:space="preserve"> </w:t>
-      </w:r>
-      <w:r>
-        <w:t xml:space="preserve">(Redley and Waugh 2018; Manias et al. 2016)</w:t>
-      </w:r>
-      <w:r>
-        <w:t xml:space="preserve">. One widely adopted format is SBAR (Situation, Background, Assessment, Recommendation), framed as a shared mental model to support concise, organised clinician-to-clinician communication</w:t>
-      </w:r>
-      <w:r>
-        <w:t xml:space="preserve"> </w:t>
-      </w:r>
-      <w:r>
-        <w:t xml:space="preserve">(Haig et al. 2006)</w:t>
-      </w:r>
-      <w:r>
-        <w:t xml:space="preserve">. However, despite widespread uptake, the evidence base for SBAR’s direct impact on patient outcomes varies by context, and systematic review findings have been described as moderate with ongoing calls for higher-quality evaluation</w:t>
-      </w:r>
-      <w:r>
-        <w:t xml:space="preserve"> </w:t>
-      </w:r>
-      <w:r>
-        <w:t xml:space="preserve">(Müller et al. 2018)</w:t>
+        <w:t xml:space="preserve">Structured handover processes aim to standardise minimum content and the format of exchange so that critical information is predictably conveyed, acted upon, and auditable. In Australia, the Communicating for Safety Standard emphasises structured clinical handover while retaining opportunities for questions, clarification, and confirmation</w:t>
+      </w:r>
+      <w:r>
+        <w:t xml:space="preserve"> </w:t>
+      </w:r>
+      <w:r>
+        <w:t xml:space="preserve">(Australian Commission on Safety and Quality in Health Care 2026; Hada et al. 2021)</w:t>
+      </w:r>
+      <w:r>
+        <w:t xml:space="preserve">. One widely used framework is SBAR (Situation, Background, Assessment, Recommendation), which organises clinician-to-clinician handover content into four information categories</w:t>
+      </w:r>
+      <w:r>
+        <w:t xml:space="preserve"> </w:t>
+      </w:r>
+      <w:r>
+        <w:t xml:space="preserve">(Yung et al. 2023)</w:t>
+      </w:r>
+      <w:r>
+        <w:t xml:space="preserve">. Recent systematic review evidence suggests that structured handoff protocols may improve some safety outcomes, but the certainty and implementation fidelity vary by protocol and setting; evidence specific to SBAR remains low certainty</w:t>
+      </w:r>
+      <w:r>
+        <w:t xml:space="preserve"> </w:t>
+      </w:r>
+      <w:r>
+        <w:t xml:space="preserve">(McCarthy et al. 2025)</w:t>
       </w:r>
       <w:r>
         <w:t xml:space="preserve">.</w:t>
@@ -685,13 +699,13 @@
         <w:pStyle w:val="BodyText"/>
       </w:pPr>
       <w:r>
-        <w:t xml:space="preserve">Even where structured tools are mandated or encouraged, handover content remains influenced by time pressure, local culture, clinician experience, and the pragmatic realities of ward work</w:t>
-      </w:r>
-      <w:r>
-        <w:t xml:space="preserve"> </w:t>
-      </w:r>
-      <w:r>
-        <w:t xml:space="preserve">(Riesenberg et al. 2010; Watson et al. 2014; Manias et al. 2016)</w:t>
+        <w:t xml:space="preserve">Even where structured tools are mandated or encouraged, their enactment in nursing handovers remains shaped by ward-level organisational and cultural conditions, time demands, interruptions, and the need to communicate patient-specific information for continuity of care</w:t>
+      </w:r>
+      <w:r>
+        <w:t xml:space="preserve"> </w:t>
+      </w:r>
+      <w:r>
+        <w:t xml:space="preserve">(Moyo et al. 2024; Chien et al. 2024)</w:t>
       </w:r>
       <w:r>
         <w:t xml:space="preserve">. This variability is amplified in bedside nursing handover where patient/family involvement is increasingly emphasised, yet research highlights tensions between standardisation (predictability) and tailoring (patient-centredness), along with barriers related to confidentiality and clinician concerns</w:t>
@@ -700,7 +714,16 @@
         <w:t xml:space="preserve"> </w:t>
       </w:r>
       <w:r>
-        <w:t xml:space="preserve">(Tobiano et al. 2018)</w:t>
+        <w:t xml:space="preserve">(Tobiano et al. 2018; Anshasi and Almayasi 2024)</w:t>
+      </w:r>
+      <w:r>
+        <w:t xml:space="preserve">. Reviews of handover mnemonics similarly emphasise local validation, clarification, and readback rather than assuming that every element is universally relevant</w:t>
+      </w:r>
+      <w:r>
+        <w:t xml:space="preserve"> </w:t>
+      </w:r>
+      <w:r>
+        <w:t xml:space="preserve">(Yung et al. 2023)</w:t>
       </w:r>
       <w:r>
         <w:t xml:space="preserve">.</w:t>
@@ -711,7 +734,51 @@
         <w:pStyle w:val="BodyText"/>
       </w:pPr>
       <w:r>
-        <w:t xml:space="preserve">Recent advances in large language models (LLMs) create an opportunity to facilitate real-time support of clinical communication and decision-making during handover. The aim of this study was to evaluate the accuracy of LLM extraction of structured information from clinical handover transcripts across tasks aligned with real-time clinical handover support.</w:t>
+        <w:t xml:space="preserve">Traditional supervised information-extraction methods can be highly effective for stable tasks with sufficiently large, task-specific labelled datasets. However, there are several potential advantages of using LLMs in this context. For example, the same instruction-driven model can be configured for heterogeneous, context-dependent tasks. This may be useful where annotated nursing handover data are limited and communication is conversational and non-linear. Prior work has demonstrated few-shot clinical information extraction with LLMs can be accurate, while also showing that performance depends materially on prompt design and task framing</w:t>
+      </w:r>
+      <w:r>
+        <w:t xml:space="preserve"> </w:t>
+      </w:r>
+      <w:r>
+        <w:t xml:space="preserve">(Agrawal et al. 2022; Sivarajkumar et al. 2024)</w:t>
+      </w:r>
+      <w:r>
+        <w:t xml:space="preserve">.</w:t>
+      </w:r>
+    </w:p>
+    <w:p>
+      <w:pPr>
+        <w:pStyle w:val="BodyText"/>
+      </w:pPr>
+      <w:r>
+        <w:t xml:space="preserve">Recent advances in large language models (LLMs) create an opportunity to support clinical handover by analysing information as it is communicated. Other studies have examined AI-based approaches to support clinical handover, although evaluations of these technologies remain limited</w:t>
+      </w:r>
+      <w:r>
+        <w:t xml:space="preserve"> </w:t>
+      </w:r>
+      <w:r>
+        <w:t xml:space="preserve">(Agha-Mir-Salim et al. 2025)</w:t>
+      </w:r>
+      <w:r>
+        <w:t xml:space="preserve">. For example, a recent multi-hospital study used an LLM to pre-generate content to support the preparation for handover</w:t>
+      </w:r>
+      <w:r>
+        <w:t xml:space="preserve"> </w:t>
+      </w:r>
+      <w:r>
+        <w:t xml:space="preserve">(Chen et al. 2026)</w:t>
+      </w:r>
+      <w:r>
+        <w:t xml:space="preserve">. An alternative application of AI yet to be investigated is to support the verbal clinician-to-clinician exchange itself. This spoken exchange remains central to transferring responsibility of care in clinical settings and provides opportunities to question, clarify, and confirm information</w:t>
+      </w:r>
+      <w:r>
+        <w:t xml:space="preserve"> </w:t>
+      </w:r>
+      <w:r>
+        <w:t xml:space="preserve">(Australian Commission on Safety and Quality in Health Care 2026; Chien et al. 2024)</w:t>
+      </w:r>
+      <w:r>
+        <w:t xml:space="preserve">. Accurate extraction of structured information from the spoken exchange is a prerequisite for developing this form of communication support. The aim of this study was to evaluate the accuracy of LLM structured information extraction from synthetic clinical handover transcripts.</w:t>
       </w:r>
       <w:bookmarkEnd w:id="33"/>
     </w:p>
@@ -728,14 +795,52 @@
       <w:pPr>
         <w:pStyle w:val="Heading3"/>
       </w:pPr>
-      <w:bookmarkStart w:id="34" w:name="study-design-and-tasks"/>
-      <w:r>
-        <w:t xml:space="preserve">Study Design and Tasks</w:t>
+      <w:bookmarkStart w:id="34" w:name="study-design"/>
+      <w:r>
+        <w:t xml:space="preserve">Study Design</w:t>
       </w:r>
     </w:p>
     <w:p>
       <w:pPr>
         <w:pStyle w:val="FirstParagraph"/>
+      </w:pPr>
+      <w:r>
+        <w:t xml:space="preserve">This study used a model-evaluation design, corresponding to the</w:t>
+      </w:r>
+      <w:r>
+        <w:t xml:space="preserve"> </w:t>
+      </w:r>
+      <w:r>
+        <w:t xml:space="preserve">“LLM evaluation”</w:t>
+      </w:r>
+      <w:r>
+        <w:t xml:space="preserve"> </w:t>
+      </w:r>
+      <w:r>
+        <w:t xml:space="preserve">research-design category in TRIPOD-LLM</w:t>
+      </w:r>
+      <w:r>
+        <w:t xml:space="preserve"> </w:t>
+      </w:r>
+      <w:r>
+        <w:t xml:space="preserve">(</w:t>
+      </w:r>
+      <w:r>
+        <w:t xml:space="preserve">Gallifant et al.</w:t>
+      </w:r>
+      <w:r>
+        <w:t xml:space="preserve"> </w:t>
+      </w:r>
+      <w:r>
+        <w:t xml:space="preserve">2025)</w:t>
+      </w:r>
+      <w:r>
+        <w:t xml:space="preserve">. This category covers studies that assess existing LLMs for their accuracy or suitability for a specific healthcare task. We compared selected LLMs and prompt configurations on predefined multilabel classification and span-extraction tasks using completed synthetic nursing handover transcripts and registered nurse annotations. The study was not an evaluation in a healthcare setting because it did not test workflow integration or clinical, administrative, or workforce outcomes.</w:t>
+      </w:r>
+    </w:p>
+    <w:p>
+      <w:pPr>
+        <w:pStyle w:val="BodyText"/>
       </w:pPr>
       <w:r>
         <w:t xml:space="preserve">Tasks related to clinical handover communication that were considered as potentially augmentable with AI assistance were identified by the researchers using a co-design process with clinicians and consumers, which will be reported separately. The tasks were:</w:t>
@@ -817,7 +922,7 @@
         <w:pStyle w:val="FirstParagraph"/>
       </w:pPr>
       <w:r>
-        <w:t xml:space="preserve">We used the publicly available NICTA Synthetic Nursing Handover Dataset, which contains realistic recordings of clinical handovers delivered by a registered nurse based on patient profiles with cardiovascular, neurological, renal, and respiratory conditions</w:t>
+        <w:t xml:space="preserve">We used the publicly available NICTA Synthetic Nursing Handover Dataset, which contains synthetic recordings of clinical handovers delivered by a registered nurse based on patient profiles with cardiovascular, neurological, renal, and respiratory conditions</w:t>
       </w:r>
       <w:r>
         <w:t xml:space="preserve"> </w:t>
@@ -885,7 +990,16 @@
         <w:pStyle w:val="FirstParagraph"/>
       </w:pPr>
       <w:r>
-        <w:t xml:space="preserve">Ethics approval was not sought because this model-evaluation study used only synthetic and simulated handover transcripts. The study did not involve human participants, identifiable patient data, access to clinical records, or delivery of an intervention to patients or clinicians.</w:t>
+        <w:t xml:space="preserve">Ethics approval was not sought because this was not human research as defined by the National Statement on Ethical Conduct in Human Research</w:t>
+      </w:r>
+      <w:r>
+        <w:t xml:space="preserve"> </w:t>
+      </w:r>
+      <w:r>
+        <w:t xml:space="preserve">(National Health and Medical Research Council et al. 2025)</w:t>
+      </w:r>
+      <w:r>
+        <w:t xml:space="preserve">. The study involved only synthetic handover transcripts generated for model evaluation, with no recruitment, observation or testing of human participants, and no use of patient, clinician, clinical-record, personal, identifiable or potentially re-identifiable data. Accordingly, the study did not require human ethics review, and a formal exemption from ethics review was not applicable.</w:t>
       </w:r>
       <w:bookmarkEnd w:id="36"/>
     </w:p>
@@ -903,7 +1017,7 @@
         <w:pStyle w:val="FirstParagraph"/>
       </w:pPr>
       <w:r>
-        <w:t xml:space="preserve">Two annotators, who are experienced clinically active Registered Nurses, independently annotated transcripts using a structured rubric. Labelled annotations that met consensus between reviewers were used as the reference labels for downstream model development and evaluation. Inter-rater reliability was not calculated because the objective of the annotation process was to develop a consensus reference standard for prompt optimisation and model comparison.</w:t>
+        <w:t xml:space="preserve">Two annotators, who are experienced clinically active Registered Nurses, independently annotated transcripts using a structured rubric. Labelled annotations that met consensus between reviewers were used as the reference labels for downstream model development and evaluation.</w:t>
       </w:r>
     </w:p>
     <w:p>
@@ -955,7 +1069,7 @@
         <w:t xml:space="preserve">(Khattab et al. 2023)</w:t>
       </w:r>
       <w:r>
-        <w:t xml:space="preserve">, which is a Python framework that can be used for prompt optimisation using feedback from model outputs to improve task performance. For each task, we defined a task-specific DSPy signature that specified the transcript as input and a constrained structured output. Checklist prediction was formulated as multilabel classification, whereas SBAR and uncertainty-related tasks were formulated as span extraction, requiring the model to return verbatim text segments from the transcript together with the appropriate label. The uncertainty-related tasks were further subdivided into a broad uncertainty-span extraction task (which included all uncertainty categories) and a more specific unknown-fact extraction task (which included only spans labelled as unknown facts).</w:t>
+        <w:t xml:space="preserve">, which is a Python framework that can be used for prompt optimisation using feedback from model outputs to improve task performance. For each task, we defined a task-specific DSPy signature that specified the transcript as input and a constrained structured output. Checklist prediction was formulated as multilabel classification, where the task was to return a list of the items from the checklist that were covered in the transcript. The SBAR and uncertainty-related tasks were formulated as span extraction requiring the model to return verbatim text segments from the transcript together with the appropriate label. The uncertainty-related tasks were further subdivided into a broad uncertainty-span extraction task (which included all uncertainty categories) and a more specific unknown-fact extraction task (which included only spans labelled as unknown facts).</w:t>
       </w:r>
     </w:p>
     <w:p>
@@ -963,7 +1077,7 @@
         <w:pStyle w:val="BodyText"/>
       </w:pPr>
       <w:r>
-        <w:t xml:space="preserve">Across the baseline DSPy evaluations, GEPA-based DSPy optimisation experiments, and LangExtract experiments, we evaluated three underlying language models: OpenAI GPT-5-nano</w:t>
+        <w:t xml:space="preserve">Across the baseline DSPy evaluations, GEPA-based DSPy optimisation experiments, and LangExtract experiments, we purposively selected 3 underlying language models with different deployment profiles: OpenAI GPT-5.2 as the higher-capacity proprietary model, OpenAI GPT-5-nano as a smaller lower-cost proprietary model</w:t>
       </w:r>
       <w:r>
         <w:t xml:space="preserve"> </w:t>
@@ -972,16 +1086,7 @@
         <w:t xml:space="preserve">(Singh et al. 2025)</w:t>
       </w:r>
       <w:r>
-        <w:t xml:space="preserve">, which served as a smaller lower-cost comparison model; OpenAI GPT-5.2</w:t>
-      </w:r>
-      <w:r>
-        <w:t xml:space="preserve"> </w:t>
-      </w:r>
-      <w:r>
-        <w:t xml:space="preserve">(Singh et al. 2025)</w:t>
-      </w:r>
-      <w:r>
-        <w:t xml:space="preserve">, which served as the highest-capacity proprietary model evaluated in this study; and MedGemma 27B, a 27-billion-parameter open-weight model developed by Google for medical tasks</w:t>
+        <w:t xml:space="preserve">, and MedGemma 27B as a 27-billion-parameter open-weight model developed for medical tasks</w:t>
       </w:r>
       <w:r>
         <w:t xml:space="preserve"> </w:t>
@@ -990,7 +1095,7 @@
         <w:t xml:space="preserve">(Sellergren et al. 2025)</w:t>
       </w:r>
       <w:r>
-        <w:t xml:space="preserve">. For DSPy baseline and GEPA runs, the same task model was used before and after compilation so that differences reflected prompt optimisation rather than a change in the underlying model.</w:t>
+        <w:t xml:space="preserve">. This panel was intended to examine matched prompt effects across contrasting model profiles, not to provide an exhaustive leaderboard of all contemporary LLMs. For DSPy baseline and GEPA runs, the same task model was used before and after optimisation so that differences reflected the prompt configuration rather than a change in the underlying model. GPT-5.2 and GPT-5-nano were accessed through cloud-hosted OpenAI API endpoints; MedGemma 27B was run locally on institutional high-performance computing infrastructure.</w:t>
       </w:r>
     </w:p>
     <w:p>
@@ -998,7 +1103,16 @@
         <w:pStyle w:val="BodyText"/>
       </w:pPr>
       <w:r>
-        <w:t xml:space="preserve">The OpenAI GPT-5-nano and GPT-5.2 experiments were run using the OpenAI API as cloud-hosted model endpoints. MedGemma 27B experiments were run locally on institutional high-performance computing infrastructure.</w:t>
+        <w:t xml:space="preserve">GEPA was used to optimise the task prompts</w:t>
+      </w:r>
+      <w:r>
+        <w:t xml:space="preserve"> </w:t>
+      </w:r>
+      <w:r>
+        <w:t xml:space="preserve">(Agrawal et al. 2025)</w:t>
+      </w:r>
+      <w:r>
+        <w:t xml:space="preserve">. It iteratively evaluated candidate task instructions, combined numeric task scores with natural-language error feedback, and used GPT-5.2 as a separate reflection model to propose revisions. Optimisation used 576 scoring calls. Checklist optimisation targeted multilabel agreement, while span-task optimisation rewarded same-label text overlap using IoU so that closer boundaries received higher scores. A transcript with neither a reference span nor a predicted span for a target label was treated as a correct negative. The final compiled prompts were fixed before evaluation on the held-out partition. For reporting, span detection performance and boundary overlap were presented separately.</w:t>
       </w:r>
     </w:p>
     <w:p>
@@ -1006,25 +1120,34 @@
         <w:pStyle w:val="BodyText"/>
       </w:pPr>
       <w:r>
-        <w:t xml:space="preserve">Baseline performance was obtained by evaluating the initial DSPy signatures. Optimised performance was obtained by compiling the same predictors on the optimisation partition. For checklist prediction, optimisation targeted example-level multilabel F1 against the labels. A prompt optimisation method called GEPA was used to optimise the prompts</w:t>
-      </w:r>
-      <w:r>
-        <w:t xml:space="preserve"> </w:t>
-      </w:r>
-      <w:r>
-        <w:t xml:space="preserve">(Agrawal et al. 2025)</w:t>
-      </w:r>
-      <w:r>
-        <w:t xml:space="preserve">. GEPA is a reflection-based evolutionary prompt optimiser within DSPy</w:t>
-      </w:r>
-      <w:r>
-        <w:t xml:space="preserve"> </w:t>
-      </w:r>
-      <w:r>
-        <w:t xml:space="preserve">(Agrawal et al. 2025)</w:t>
-      </w:r>
-      <w:r>
-        <w:t xml:space="preserve">. This approach involves iteratively proposing revised task instructions and retains variants that improve task-specific performance. The optimisation was conducted over 576 scoring calls of the full program, which is equivalent to about 3 complete scoring passes over the combined training and validation examples used during prompt search. GEPA was supplied with both a scalar score and natural-language error feedback. For checklist prediction, feedback identified which labels had been correctly included, incorrectly added, or omitted. For span-extraction tasks, feedback described the reference spans, predicted spans, matched and unmatched spans, and the extent of span-boundary overlap. This feedback was then used by a separate reflection model (GPT-5.2) to generate revised instructions for the predictor. GPT-5.2 was selected as the reflection model because it was the strongest performing model available within our evaluation framework at the time. For SBAR and other span-extraction tasks, GEPA optimisation was driven by a metric based on intersection-over-union. In practical terms, intersection-over-union measured how much the predicted text span overlapped the annotated text span relative to the total text covered by either span. Higher values of intersection-over-union indicate closer agreement on the start and end boundaries of the labelled span. To calculate intersection-over-union, predicted quotes were mapped back to their location in the transcript and matched to reference spans of the same label according to overlap, with higher-overlap matches receiving greater reward during prompt search. In this way, prompt search favoured not only correct matching but also closer boundary alignment. When neither reference nor predicted spans were present for a transcript, the transcript-level optimisation score was set to 1.0. For reporting, we then separated detection performance from boundary quality by presenting matched-span precision, recall, and F1 together with mean IoU for matched spans. The final compiled programs were then fixed and evaluated on the held-out test partition.</w:t>
+        <w:t xml:space="preserve">In addition to DSPy prompt optimisations, we conducted separate evaluations using the LangExtract framework, as a prompt-based few-shot structured information extraction approach for the SBAR, uncertainty-span, and unknown-fact span tasks</w:t>
+      </w:r>
+      <w:r>
+        <w:t xml:space="preserve"> </w:t>
+      </w:r>
+      <w:r>
+        <w:t xml:space="preserve">(Goel 2026)</w:t>
+      </w:r>
+      <w:r>
+        <w:t xml:space="preserve">. These experiments used task-specific prompt descriptions together with annotated in-context examples derived from the reference data. We used 10 annotated examples from the training partition as few-shot exemplars, and inference was then performed on the full held-out test partition for each task.</w:t>
+      </w:r>
+      <w:bookmarkEnd w:id="38"/>
+    </w:p>
+    <w:p>
+      <w:pPr>
+        <w:pStyle w:val="Heading3"/>
+      </w:pPr>
+      <w:bookmarkStart w:id="39" w:name="data-analysis"/>
+      <w:r>
+        <w:t xml:space="preserve">Data analysis</w:t>
+      </w:r>
+    </w:p>
+    <w:p>
+      <w:pPr>
+        <w:pStyle w:val="FirstParagraph"/>
+      </w:pPr>
+      <w:r>
+        <w:t xml:space="preserve">Inter-rater agreement was assessed with Cohen’s kappa and mean intersection over union (IoU) among matched spans. Agreement confidence intervals were calculated with 2,000 bootstrap resamples of transcript pairs using a fixed random seed.</w:t>
       </w:r>
     </w:p>
     <w:p>
@@ -1032,34 +1155,7 @@
         <w:pStyle w:val="BodyText"/>
       </w:pPr>
       <w:r>
-        <w:t xml:space="preserve">In addition to DSPy prompt optimisations, we conducted separate evaluations using the LangExtract framework, as a prompt-based few-shot extraction approach for the SBAR, uncertainty-span, and unknown-fact span tasks</w:t>
-      </w:r>
-      <w:r>
-        <w:t xml:space="preserve"> </w:t>
-      </w:r>
-      <w:r>
-        <w:t xml:space="preserve">(Goel 2026)</w:t>
-      </w:r>
-      <w:r>
-        <w:t xml:space="preserve">. Within this framework, extraction experiments were run with GPT-5.2 and MedGemma 27B; GPT-5-nano was evaluated within the DSPy baseline and GEPA workflows rather than the LangExtract experiments. These experiments used task-specific prompt descriptions together with annotated in-context examples derived from the reference data. We used 10 annotated examples from the training partition as few-shot exemplars, and inference was then performed on the full held-out test partition for each task. Few-shot examples were validated to ensure alignment between the quoted extraction and the source transcript before inference. LangExtract outputs were normalised to the same label-and-verbatim-quote representation used for the DSPy span tasks and were scored with the same matching and overlap-based evaluation procedure, allowing direct comparison across methods. For the binary unknown-fact experiments, the few-shot example set was additionally constrained to include positive examples of the target label.</w:t>
-      </w:r>
-      <w:bookmarkEnd w:id="38"/>
-    </w:p>
-    <w:p>
-      <w:pPr>
-        <w:pStyle w:val="Heading3"/>
-      </w:pPr>
-      <w:bookmarkStart w:id="39" w:name="data-analysis"/>
-      <w:r>
-        <w:t xml:space="preserve">Data analysis</w:t>
-      </w:r>
-    </w:p>
-    <w:p>
-      <w:pPr>
-        <w:pStyle w:val="FirstParagraph"/>
-      </w:pPr>
-      <w:r>
-        <w:t xml:space="preserve">Performance was measured with standard classification metrics for the checklist content detection task. At the level of individual labels, we calculated counts of true positives, false positives, false negatives, and true negatives, together with precision, recall, and F1. Aggregate performance was summarised using micro-averaged (pooled), macro-averaged (unweighted mean), and support-weighted precision, recall, and F1 across labels.</w:t>
+        <w:t xml:space="preserve">Performance was measured for the checklist content detection task at the level of individual labels with counts of true positives, false positives, false negatives, and true negatives, together with precision, recall, and F1. Aggregate performance was summarised using micro-averaged (pooled), macro-averaged (unweighted mean), and support-weighted precision, recall, and F1 across labels.</w:t>
       </w:r>
     </w:p>
     <w:p>
@@ -1067,7 +1163,7 @@
         <w:pStyle w:val="BodyText"/>
       </w:pPr>
       <w:r>
-        <w:t xml:space="preserve">For span-extraction tasks, model outputs were represented as label-and-quote pairs, and each predicted quote was mapped back to a character span in the source transcript using exact string matching, with approximate matching used only when an exact match was unavailable. Predicted spans were then matched one-to-one with reference spans of the same label according to highest overlap. Under this greedy matching procedure, a reported match was defined as a same-label pair with non-zero overlap. Precision, recall, and F1 were then calculated from these matched gold and predicted spans as binary detection measures, so that these statistics reflected the model’s ability to identify the correct labelled spans. Span-boundary agreement was reported separately using the mean intersection over union (IoU) across matched pairs. We additionally calculated per-label descriptive metrics including the number of reference spans, the number of predicted spans, matched-span precision, recall, F1, and mean IoU.</w:t>
+        <w:t xml:space="preserve">For span-extraction tasks, precision, recall, and F1 were calculated from predicted spans as binary detection measures, so that these statistics reflected the model’s ability to identify the correct labelled spans. Span-boundary agreement was reported separately using the mean intersection over union (IoU) across matched pairs. We additionally calculated per-label descriptive metrics including the number of reference spans, the number of predicted spans, matched-span precision, recall, F1, and mean IoU.</w:t>
       </w:r>
     </w:p>
     <w:p>
@@ -1075,7 +1171,7 @@
         <w:pStyle w:val="BodyText"/>
       </w:pPr>
       <w:r>
-        <w:t xml:space="preserve">Sampling uncertainty was summarised with 95% confidence intervals calculated using non-parametric bootstrap resampling of evaluation transcripts. For each result, we resampled transcripts with replacement 2,000 times using a fixed random seed and recalculated the relevant metric from the pooled counts in each resample. Confidence limits are reported as the 2.5th and 97.5th percentiles of the bootstrap distribution. For checklist items, accuracy was calculated as (true positives + true negatives) divided by all evaluated transcripts for that item. Confidence intervals for precision, recall, F1, macro-F1, support-weighted F1, and mean IoU were calculated by applying the same transcript-level bootstrap procedure and recomputing each statistic within each resample.</w:t>
+        <w:t xml:space="preserve">Sampling uncertainty was summarised with 95% confidence intervals calculated using non-parametric bootstrap resampling. For each result, we resampled transcripts with replacement 2,000 times using a fixed random seed and recalculated the relevant metric from the pooled counts in each resample. Confidence limits are reported as the 2.5th and 97.5th percentiles of the bootstrap distribution.</w:t>
       </w:r>
       <w:bookmarkEnd w:id="39"/>
       <w:bookmarkEnd w:id="40"/>
@@ -1084,7 +1180,7 @@
       <w:pPr>
         <w:pStyle w:val="Heading2"/>
       </w:pPr>
-      <w:bookmarkStart w:id="45" w:name="sec-results"/>
+      <w:bookmarkStart w:id="46" w:name="sec-results"/>
       <w:r>
         <w:t xml:space="preserve">Results</w:t>
       </w:r>
@@ -1093,7 +1189,25 @@
       <w:pPr>
         <w:pStyle w:val="Heading3"/>
       </w:pPr>
-      <w:bookmarkStart w:id="41" w:name="sec-results-summary"/>
+      <w:bookmarkStart w:id="41" w:name="sec-inter-rater-agreement"/>
+      <w:r>
+        <w:t xml:space="preserve">Pre-consensus inter-rater agreement</w:t>
+      </w:r>
+    </w:p>
+    <w:p>
+      <w:pPr>
+        <w:pStyle w:val="FirstParagraph"/>
+      </w:pPr>
+      <w:r>
+        <w:t xml:space="preserve">Cohen’s kappa was 0.75 (95% CI 0.73-0.76) for checklist decisions, 0.70 (95% CI 0.68-0.72) for pooled SBAR token-by-label decisions, 0.12 (95% CI 0.08-0.15) for broad uncertainty, and 0.40 (95% CI 0.18-0.64) for unknown facts. Among overlapping same-label spans, mean IoU was 0.86 (95% CI 0.85-0.87) for SBAR, 0.71 (95% CI 0.61-0.81) for broad uncertainty, and 0.78 (95% CI 0.56-0.98) for unknown facts. The relatively high matched-span IoU indicates similar boundaries when both nurses identified the same span type, with disagreement in uncertainty annotations arising mainly over whether and how to label an expression.</w:t>
+      </w:r>
+      <w:bookmarkEnd w:id="41"/>
+    </w:p>
+    <w:p>
+      <w:pPr>
+        <w:pStyle w:val="Heading3"/>
+      </w:pPr>
+      <w:bookmarkStart w:id="42" w:name="sec-results-summary"/>
       <w:r>
         <w:t xml:space="preserve">Key findings</w:t>
       </w:r>
@@ -1103,7 +1217,7 @@
         <w:pStyle w:val="FirstParagraph"/>
       </w:pPr>
       <w:r>
-        <w:t xml:space="preserve">Within-model comparisons showed consistent point-estimate gains with DSPy/GEPA over matched baselines. For GPT-5.2, micro-F1 increased from 0.77 (95% CI 0.74-0.80) to 0.85 (95% CI 0.83-0.88) for checklist prediction, from 0.51 (95% CI 0.47-0.55) to 0.76 (95% CI 0.72-0.79) for SBAR span extraction, from 0.35 (95% CI 0.28-0.41) to 0.41 (95% CI 0.33-0.48) for uncertainty span extraction, and from 0.76 (95% CI 0.50-1.00) to 0.84 (95% CI 0.63-1.00) for unknown-fact extraction. Across span tasks, LangExtract generally performed below the corresponding best DSPy/GEPA configuration. Among matched span predictions, boundary agreement was high, with mean intersection-over-union values exceeding 0.8 for the best-performing GPT-5.2 span-extraction models.</w:t>
+        <w:t xml:space="preserve">Within-model comparisons showed consistent point-estimate gains with DSPy/GEPA over matched unoptimised-prompt baselines. For GPT-5.2, micro-F1 increased from 0.77 (95% CI 0.74-0.80) to 0.85 (95% CI 0.83-0.88) for checklist prediction, from 0.51 (95% CI 0.47-0.55) to 0.76 (95% CI 0.72-0.79) for SBAR span extraction, from 0.35 (95% CI 0.28-0.41) to 0.41 (95% CI 0.33-0.48) for uncertainty span extraction, and from 0.76 (95% CI 0.50-1.00) to 0.84 (95% CI 0.63-1.00) for unknown-fact extraction. Across span tasks, LangExtract generally had lower point estimates than the corresponding highest DSPy/GEPA configuration. Among matched span predictions, mean intersection over union exceeded 0.8 for the highest-performing GPT-5.2 span-extraction configurations.</w:t>
       </w:r>
       <w:r>
         <w:t xml:space="preserve"> </w:t>
@@ -1120,15 +1234,15 @@
         <w:t xml:space="preserve"> </w:t>
       </w:r>
       <w:r>
-        <w:t xml:space="preserve">summarizes matched within-model comparisons across tasks for the three models evaluated.</w:t>
-      </w:r>
-      <w:bookmarkEnd w:id="41"/>
+        <w:t xml:space="preserve">summarises matched within-model comparisons across tasks for the 3 evaluated models.</w:t>
+      </w:r>
+      <w:bookmarkEnd w:id="42"/>
     </w:p>
     <w:p>
       <w:pPr>
         <w:pStyle w:val="Heading3"/>
       </w:pPr>
-      <w:bookmarkStart w:id="42" w:name="sec-sbar-optimized"/>
+      <w:bookmarkStart w:id="43" w:name="sec-sbar-optimized"/>
       <w:r>
         <w:t xml:space="preserve">SBAR span extraction</w:t>
       </w:r>
@@ -1179,13 +1293,13 @@
       <w:r>
         <w:t xml:space="preserve">.</w:t>
       </w:r>
-      <w:bookmarkEnd w:id="42"/>
+      <w:bookmarkEnd w:id="43"/>
     </w:p>
     <w:p>
       <w:pPr>
         <w:pStyle w:val="Heading3"/>
       </w:pPr>
-      <w:bookmarkStart w:id="43" w:name="sec-checklist"/>
+      <w:bookmarkStart w:id="44" w:name="sec-checklist"/>
       <w:r>
         <w:t xml:space="preserve">Checklist task</w:t>
       </w:r>
@@ -1214,13 +1328,13 @@
       <w:r>
         <w:t xml:space="preserve">presents grouped per-label estimates for accuracy, precision, recall, and F1 for the best-performing GPT-5.2 checklist model.</w:t>
       </w:r>
-      <w:bookmarkEnd w:id="43"/>
+      <w:bookmarkEnd w:id="44"/>
     </w:p>
     <w:p>
       <w:pPr>
         <w:pStyle w:val="Heading3"/>
       </w:pPr>
-      <w:bookmarkStart w:id="44" w:name="sec-uncertainty-results"/>
+      <w:bookmarkStart w:id="45" w:name="sec-uncertainty-results"/>
       <w:r>
         <w:t xml:space="preserve">Uncertainty and unknown-fact span extraction</w:t>
       </w:r>
@@ -1230,7 +1344,7 @@
         <w:pStyle w:val="FirstParagraph"/>
       </w:pPr>
       <w:r>
-        <w:t xml:space="preserve">Broad uncertainty-span extraction included all annotated uncertainty categories (hedging, vagueness, unknown facts, indefinite timing, source uncertainty, procedural uncertainty, and responsibility uncertainty) and had the weakest accuracy of all tasks. The best DSPy/GEPA run used GPT-5.2 and achieved precision 0.32 (95% CI 0.26-0.39), recall 0.56 (95% CI 0.44-0.67), micro-F1 0.41 (95% CI 0.33-0.48), and mean IoU 0.83 (95% CI 0.77-0.90). This was only a modest improvement over the best baseline run (micro-F1 0.35 (95% CI 0.28-0.41)), and the best LangExtract uncertainty run remained low (micro-F1 0.24 (95% CI 0.17-0.31)).</w:t>
+        <w:t xml:space="preserve">Broad uncertainty-span extraction included all annotated uncertainty categories (hedging, vagueness, unknown facts, indefinite timing, source uncertainty, procedural uncertainty, and responsibility uncertainty) and had the lowest micro-F1 of the evaluated tasks. The highest DSPy/GEPA point estimate used GPT-5.2 and achieved precision 0.32 (95% CI 0.26-0.39), recall 0.56 (95% CI 0.44-0.67), micro-F1 0.41 (95% CI 0.33-0.48), and mean IoU 0.83 (95% CI 0.77-0.90). The highest unoptimised-prompt baseline had micro-F1 0.35 (95% CI 0.28-0.41), and the highest LangExtract uncertainty result had micro-F1 0.24 (95% CI 0.17-0.31).</w:t>
       </w:r>
     </w:p>
     <w:p>
@@ -1238,7 +1352,7 @@
         <w:pStyle w:val="BodyText"/>
       </w:pPr>
       <w:r>
-        <w:t xml:space="preserve">The narrower unknown-fact sub-task performed substantially better. DSPy/GEPA reached micro-F1 0.84 (95% CI 0.63-1.00) with GPT-5.2, compared with the best baseline micro-F1 of 0.76 (95% CI 0.50-1.00) and the LangExtract GPT-5.2 micro-F1 of 0.56 (95% CI 0.29-0.72). These results suggest that explicitly stated information gaps were more tractable than the broader set of uncertainty spans.</w:t>
+        <w:t xml:space="preserve">The narrower unknown-fact sub-task had higher point estimates. DSPy/GEPA reached micro-F1 0.84 (95% CI 0.63-1.00) with GPT-5.2, compared with the highest baseline micro-F1 of 0.76 (95% CI 0.50-1.00) and the LangExtract GPT-5.2 micro-F1 of 0.56 (95% CI 0.29-0.72). These results concern explicitly stated lack of knowledge, not facts absent from the transcript.</w:t>
       </w:r>
       <w:r>
         <w:t xml:space="preserve"> </w:t>
@@ -1257,14 +1371,14 @@
       <w:r>
         <w:t xml:space="preserve">summarises the uncertainty and unknown-fact span results used for these comparisons.</w:t>
       </w:r>
-      <w:bookmarkEnd w:id="44"/>
       <w:bookmarkEnd w:id="45"/>
+      <w:bookmarkEnd w:id="46"/>
     </w:p>
     <w:p>
       <w:pPr>
         <w:pStyle w:val="Heading2"/>
       </w:pPr>
-      <w:bookmarkStart w:id="50" w:name="sec-discussion"/>
+      <w:bookmarkStart w:id="51" w:name="sec-discussion"/>
       <w:r>
         <w:t xml:space="preserve">Discussion</w:t>
       </w:r>
@@ -1273,7 +1387,7 @@
       <w:pPr>
         <w:pStyle w:val="Heading3"/>
       </w:pPr>
-      <w:bookmarkStart w:id="46" w:name="principal-results"/>
+      <w:bookmarkStart w:id="47" w:name="principal-results"/>
       <w:r>
         <w:t xml:space="preserve">Principal Results</w:t>
       </w:r>
@@ -1318,7 +1432,7 @@
         <w:t xml:space="preserve">(Ong and Coiera 2011; Manser and Foster 2011; Riesenberg et al. 2010)</w:t>
       </w:r>
       <w:r>
-        <w:t xml:space="preserve">. The clinical value lies less in producing a structured summary after handover than in shaping the handover dialogue before responsibility transfers. Although checklist prediction achieved strong pooled performance, the model still produced both false positives and false negatives. A false negative would usually create review burden by prompting clarification of an item that was already communicated, but a false positive could create more serious false reassurance that a safety-critical element was conveyed when it was not. A safer near-term design could therefore present AI outputs as source-linked prompts for clinician review, with clear distinctions between detected in transcript, not detected, and requires verification. Evidence indicated that effective clinical decision support is most useful when integrated into a workflow as actionable and readily available support at the time and place of decision-making, while also recognising the risk of automation bias when clinicians over-rely on system outputs</w:t>
+        <w:t xml:space="preserve">. Although checklist prediction achieved high accuracy, the consequences of both false positives and false negatives should be considered. A false negative would usually create review burden by prompting clarification of an item that was already communicated, but a false positive could create more serious false reassurance that a safety-critical element was conveyed when it was not. In addition, a checklist item not detected in the captured transcript is not equivalent to clinically necessary information having been omitted. A safer near-term design could therefore present AI outputs as source-linked prompts for clinician review, with clear distinctions between detected in transcript, not detected, and requires verification. Evidence has indicated that effective clinical decision support is most useful when integrated into a workflow as actionable and readily available support at the time and place of decision-making, while also recognising the risk of automation bias when clinicians over-rely on system outputs</w:t>
       </w:r>
       <w:r>
         <w:t xml:space="preserve"> </w:t>
@@ -1335,7 +1449,32 @@
         <w:pStyle w:val="BodyText"/>
       </w:pPr>
       <w:r>
-        <w:t xml:space="preserve">In the same way, SBAR span extraction may be most useful as a traceability mechanism rather than as a fully automated handover summary. The optimised model achieved useful SBAR performance and high span-boundary overlap among matched spans in our study. However, SBAR is an idealised communication framework, while real clinical handovers often move non-linearly, revisit information, distribute relevant details across the conversation, or place content between categories. For implementation, this suggests that extracted spans could be displayed with a link to their source transcript context and should support clinician review of what was said, rather than automatically transforming the handover into a definitive structured note. This preserves the benefits of structured communication while avoiding over-compression of clinically meaningful narrative context</w:t>
+        <w:t xml:space="preserve">Registered nurse annotation agreement was comparatively high for checklist and SBAR annotations but very low for the broad uncertainty taxonomy. The latter finding indicates that vague, hedged, or context-dependent communication was difficult to operationalise consistently even with written guidance. However, the combination of low kappa and relatively high matched IoU scores for broad uncertainty indicates that the principal difficulty was deciding whether uncertainty was present, rather than locating its boundaries once identified. As all model optimisation and evaluation used the final consensus ratings between annotators, the results should therefore be interpreted as being conservative.</w:t>
+      </w:r>
+    </w:p>
+    <w:p>
+      <w:pPr>
+        <w:pStyle w:val="BodyText"/>
+      </w:pPr>
+      <w:r>
+        <w:t xml:space="preserve">This study did not compare LLMs with non-LLM-based methods of structured information extraction. It therefore provides evidence about relative prompt optimisation approaches and model configurations, not the superiority of LLMs over conventional information extraction. Nevertheless, evaluating LLM-based approaches is a logical next step in this handover-specific research programme. In the original NICTA benchmark, a feature-engineered conditional random field achieved macro-F1 0.702 across 35 handover-form categories, but performance was markedly uneven. F1 was 0.217 for the more abstract “other observations” category and 0.496 for future-care goals, tasks, and expected outcomes, and the error analysis identified clinically relevant missed and misclassified information</w:t>
+      </w:r>
+      <w:r>
+        <w:t xml:space="preserve"> </w:t>
+      </w:r>
+      <w:r>
+        <w:t xml:space="preserve">(Suominen et al. 2015)</w:t>
+      </w:r>
+      <w:r>
+        <w:t xml:space="preserve">. These limitations were concentrated in categories requiring greater contextual differentiation. Instruction-tuned LLMs therefore warranted evaluation as a potentially more flexible approach to context-dependent handover information, particularly where prompt optimisation can adapt extraction behaviour using a modest labelled set.</w:t>
+      </w:r>
+    </w:p>
+    <w:p>
+      <w:pPr>
+        <w:pStyle w:val="BodyText"/>
+      </w:pPr>
+      <w:r>
+        <w:t xml:space="preserve">The optimised SBAR extraction model achieved high span-boundary overlap among matched spans in our study. It should be considered, though, that SBAR is an idealised communication framework, while real clinical handovers often move non-linearly, revisit information, distribute relevant details across the conversation, or place content between categories. For implementation, this suggests that extracted spans could be displayed with a link to their source transcript context and should support clinician review of what was said, rather than automatically transforming the handover into a definitive structured note. This preserves the benefits of structured communication while avoiding over-compression of clinically meaningful narrative context</w:t>
       </w:r>
       <w:r>
         <w:t xml:space="preserve"> </w:t>
@@ -1346,13 +1485,13 @@
       <w:r>
         <w:t xml:space="preserve">.</w:t>
       </w:r>
-      <w:bookmarkEnd w:id="46"/>
+      <w:bookmarkEnd w:id="47"/>
     </w:p>
     <w:p>
       <w:pPr>
         <w:pStyle w:val="Heading3"/>
       </w:pPr>
-      <w:bookmarkStart w:id="47" w:name="implementation-considerations"/>
+      <w:bookmarkStart w:id="48" w:name="implementation-considerations"/>
       <w:r>
         <w:t xml:space="preserve">Implementation Considerations</w:t>
       </w:r>
@@ -1362,7 +1501,7 @@
         <w:pStyle w:val="FirstParagraph"/>
       </w:pPr>
       <w:r>
-        <w:t xml:space="preserve">The appropriate balance between recall and precision may differ by use case when considering implementation of the tasks we evaluated in this study into an AI tool to support clinical handover. For real-time clinician support, the intervention should be framed as shaping safe handover dialogue rather than only producing a structured output after the exchange has ended. Higher recall may be acceptable if prompts are phrased as optional checks and do not imply that an item is definitely missing, because the receiving clinician can rapidly accept, dismiss, or clarify the prompt before responsibility transfers. For retrospective audit or compliance monitoring, precision becomes more important because false positives could overestimate handover quality and obscure residual safety risks. The present checklist results, with strong recall but non-trivial false positives in several categories, therefore support cautious separation of two implementation pathways: real-time clinician-facing gap prompts, and separately validated audit/reporting workflows</w:t>
+        <w:t xml:space="preserve">The appropriate balance between recall and precision may differ by use case when considering implementation of the tasks we evaluated in this study into an AI tool to support clinical handover. For real-time clinician support, the intervention should be framed as shaping safe handover dialogue rather than only producing a structured output after the exchange has ended. Higher recall may be appropriate where the system displays non-detected checklist items under an “Items to check” heading and allows the receiving clinician to mark each item as addressed, not relevant, or requiring clarification. This presentation would avoid implying that the information was definitely omitted while supporting clarification before responsibility transfers. For retrospective audit or compliance monitoring, precision becomes more important because false positives could overestimate handover quality and obscure residual safety risks. The present checklist results, with high recall but non-trivial false positives in several categories, therefore support cautious separation of two implementation pathways: real-time clinician-facing gap prompts, and separately validated audit/reporting workflows</w:t>
       </w:r>
       <w:r>
         <w:t xml:space="preserve"> </w:t>
@@ -1412,7 +1551,7 @@
         <w:t xml:space="preserve"> </w:t>
       </w:r>
       <w:r>
-        <w:t xml:space="preserve">can convey concern through context, trajectory, and prior knowledge rather than through explicit wording that a model can reliably extract. By contrast, the comparatively stronger unknown-fact extraction results suggest a potentially useful role for identifying explicit information gaps that can be converted into clarification prompts for the receiving clinician. As foundation models continue to improve, accuracy on this task may also improve, although reliable use in safety-critical handover settings will still require ongoing empirical validation.</w:t>
+        <w:t xml:space="preserve">can convey concern through context, trajectory, and prior knowledge rather than through explicit wording that a model can reliably extract. By contrast, the comparatively more accurate unknown-fact extraction results suggest a potentially useful role for identifying explicit information gaps that can be converted into clarification prompts for the receiving clinician. As foundation models continue to improve, accuracy on this task may also improve, although reliable use in safety-critical handover settings will still require ongoing empirical validation.</w:t>
       </w:r>
     </w:p>
     <w:p>
@@ -1475,13 +1614,13 @@
       <w:r>
         <w:t xml:space="preserve">.</w:t>
       </w:r>
-      <w:bookmarkEnd w:id="47"/>
+      <w:bookmarkEnd w:id="48"/>
     </w:p>
     <w:p>
       <w:pPr>
         <w:pStyle w:val="Heading3"/>
       </w:pPr>
-      <w:bookmarkStart w:id="48" w:name="sec-limitations"/>
+      <w:bookmarkStart w:id="49" w:name="sec-limitations"/>
       <w:r>
         <w:t xml:space="preserve">Limitations</w:t>
       </w:r>
@@ -1508,7 +1647,7 @@
         <w:pStyle w:val="BodyText"/>
       </w:pPr>
       <w:r>
-        <w:t xml:space="preserve">It should be noted that several checklist items had low prevalence in the evaluation partition, including the three-patient-identifier verification, advance care planning, critical monitoring/alarms, and critical actions required. Reliable implementation decisions cannot be made from aggregate micro-F1 when rare but high-consequence labels are underrepresented. Future evaluation should oversample or otherwise specifically test these items</w:t>
+        <w:t xml:space="preserve">It should be noted that several checklist items had low prevalence in the evaluation partition. Future evaluation should oversample or otherwise specifically test these items</w:t>
       </w:r>
       <w:r>
         <w:t xml:space="preserve"> </w:t>
@@ -1517,60 +1656,79 @@
         <w:t xml:space="preserve">(Challen et al. 2019; Riesenberg et al. 2010)</w:t>
       </w:r>
       <w:r>
-        <w:t xml:space="preserve">. The reference standard retained only annotations agreed by both reviewers. This creates a conservative and reproducible benchmark, but may exclude ambiguous or contested communication–precisely the type of handover content that can be clinically important. As a result, model performance may be overestimated for clear-cut cases and less informative for the ambiguous, implicit, or disputed information that often drives clarification needs during real handover</w:t>
-      </w:r>
-      <w:r>
-        <w:t xml:space="preserve"> </w:t>
-      </w:r>
-      <w:r>
-        <w:t xml:space="preserve">(Cohen and Hilligoss 2010; Manser and Foster 2011)</w:t>
+        <w:t xml:space="preserve">. Furthermore, the reference standard retained only annotations agreed by both reviewers. This creates a conservative and reproducible benchmark, but may exclude ambiguous or contested communication.</w:t>
+      </w:r>
+    </w:p>
+    <w:p>
+      <w:pPr>
+        <w:pStyle w:val="BodyText"/>
+      </w:pPr>
+      <w:r>
+        <w:t xml:space="preserve">The evaluation corpus included synthetic transcripts generated in part with GPT-5. Although the uses were distinct, information extraction tasks were performed on synthesised language from a model from the same LLM provider, which is potentially susceptible to model familiarity. Synthetic transcripts may also be more predictable than authentic handover communication. In addition, the highest-performing models evaluated in this study were hosted proprietary systems that are updated and managed externally. Model updates, infrastructure variability, or configuration changes could alter performance over time in ways that are not fully transparent or controllable, with implications for reproducibility, governance, and consistency in clinical settings where reliability is critical. Locally hosted models may offer greater control over model versioning and deployment conditions, but can require substantial compute and may be less responsive to rapid improvements in frontier model capability.</w:t>
+      </w:r>
+    </w:p>
+    <w:p>
+      <w:pPr>
+        <w:pStyle w:val="BodyText"/>
+      </w:pPr>
+      <w:r>
+        <w:t xml:space="preserve">Our evaluation focused on downstream extraction from transcripts and did not separately quantify transcription accuracy, speaker attribution, or the effect of noisy audio. In a real-time handover system, errors introduced before the LLM stage could alter checklist detection, SBAR span extraction, and uncertainty identification. End-to-end evaluation should therefore include audio capture, transcription, diarisation, and transcript-to-output performance under realistic clinical conditions</w:t>
+      </w:r>
+      <w:r>
+        <w:t xml:space="preserve"> </w:t>
+      </w:r>
+      <w:r>
+        <w:t xml:space="preserve">(Sittig and Singh 2010; Ong and Coiera 2011)</w:t>
+      </w:r>
+      <w:r>
+        <w:t xml:space="preserve">. We used a checklist that was developed at a local institution based on local priorities for communication during clinical nursing handover. Other wards, specialties, transfer types, or jurisdictions may prioritise different minimum datasets or use different terminology. Implementation would therefore require local mapping of labels to existing handover policy, audit tools, escalation pathways, and documentation workflows, followed by local validation rather than direct transfer of the reported performance estimates</w:t>
+      </w:r>
+      <w:r>
+        <w:t xml:space="preserve"> </w:t>
+      </w:r>
+      <w:r>
+        <w:t xml:space="preserve">(Redley and Waugh 2018; Riesenberg et al. 2010; Sittig and Singh 2010)</w:t>
       </w:r>
       <w:r>
         <w:t xml:space="preserve">.</w:t>
       </w:r>
-    </w:p>
-    <w:p>
-      <w:pPr>
-        <w:pStyle w:val="BodyText"/>
-      </w:pPr>
-      <w:r>
-        <w:t xml:space="preserve">The evaluation corpus included synthetic transcripts generated in part with GPT-5. Although the uses were distinct, information extraction tasks were performed on synthesised language from a model from the same LLM provider, which is potentially susceptible to model familiarity. In addition, the highest-performing models evaluated in this study were hosted proprietary systems that are updated and managed externally. Model updates, infrastructure variability, or configuration changes could alter performance over time in ways that are not fully transparent or controllable, with implications for reproducibility, governance, and consistency in clinical settings where reliability is critical. Locally hosted models may offer greater control over model versioning and deployment conditions, but can require substantial compute and may be less responsive to rapid improvements in frontier model capability.</w:t>
-      </w:r>
-    </w:p>
-    <w:p>
-      <w:pPr>
-        <w:pStyle w:val="BodyText"/>
-      </w:pPr>
-      <w:r>
-        <w:t xml:space="preserve">Our evaluation focused on downstream extraction from transcripts and did not separately quantify transcription accuracy, speaker attribution, or the effect of noisy audio. In a real-time handover system, errors introduced before the LLM stage could alter checklist detection, SBAR span extraction, and uncertainty identification. End-to-end evaluation should therefore include audio capture, transcription, diarisation, and transcript-to-output performance under realistic clinical conditions</w:t>
-      </w:r>
-      <w:r>
-        <w:t xml:space="preserve"> </w:t>
-      </w:r>
-      <w:r>
-        <w:t xml:space="preserve">(Sittig and Singh 2010; Ong and Coiera 2011)</w:t>
-      </w:r>
-      <w:r>
-        <w:t xml:space="preserve">. We used a checklist that was developed at a local institution based on local priorities for communication during clinical nursing handover. Other wards, specialties, transfer types, or jurisdictions may prioritise different minimum datasets or use different terminology. Implementation would therefore require local mapping of labels to existing handover policy, audit tools, escalation pathways, and documentation workflows, followed by local validation rather than direct transfer of the reported performance estimates</w:t>
-      </w:r>
-      <w:r>
-        <w:t xml:space="preserve"> </w:t>
-      </w:r>
-      <w:r>
-        <w:t xml:space="preserve">(Redley and Waugh 2018; Riesenberg et al. 2010; Sittig and Singh 2010)</w:t>
+      <w:bookmarkEnd w:id="49"/>
+    </w:p>
+    <w:p>
+      <w:pPr>
+        <w:pStyle w:val="Heading3"/>
+      </w:pPr>
+      <w:bookmarkStart w:id="50" w:name="sec-conclusion"/>
+      <w:r>
+        <w:t xml:space="preserve">Conclusions</w:t>
+      </w:r>
+    </w:p>
+    <w:p>
+      <w:pPr>
+        <w:pStyle w:val="FirstParagraph"/>
+      </w:pPr>
+      <w:r>
+        <w:t xml:space="preserve">In this evaluation of AI-assisted clinical handover tasks, prompt optimisation consistently improved matched model performance. Accuracy was highest for bounded checklist prediction and SBAR span extraction. Broad uncertainty detection remained insufficiently reliable, while explicit unknown-fact extraction suggests a narrower but important role for prompting clarification when missing knowledge is directly expressed. Before clinical deployment, these approaches require external validation on real handover audio and transcripts, end-to-end testing of transcription and diarisation effects, local calibration of checklist definitions, human-factors evaluation of trust, reliance, workflow burden, and downstream safety outcomes, and structured assessment of organisational readiness for AI implementation in nursing care</w:t>
+      </w:r>
+      <w:r>
+        <w:t xml:space="preserve"> </w:t>
+      </w:r>
+      <w:r>
+        <w:t xml:space="preserve">(Seibert et al. 2026)</w:t>
       </w:r>
       <w:r>
         <w:t xml:space="preserve">.</w:t>
       </w:r>
-      <w:bookmarkEnd w:id="48"/>
-    </w:p>
-    <w:p>
-      <w:pPr>
-        <w:pStyle w:val="Heading3"/>
-      </w:pPr>
-      <w:bookmarkStart w:id="49" w:name="sec-conclusion"/>
-      <w:r>
-        <w:t xml:space="preserve">Conclusions</w:t>
+      <w:bookmarkEnd w:id="50"/>
+      <w:bookmarkEnd w:id="51"/>
+    </w:p>
+    <w:p>
+      <w:pPr>
+        <w:pStyle w:val="Heading2"/>
+      </w:pPr>
+      <w:bookmarkStart w:id="52" w:name="sec-acknowledgments"/>
+      <w:r>
+        <w:t xml:space="preserve">Acknowledgments</w:t>
       </w:r>
     </w:p>
     <w:p>
@@ -1578,27 +1736,17 @@
         <w:pStyle w:val="FirstParagraph"/>
       </w:pPr>
       <w:r>
-        <w:t xml:space="preserve">In this evaluation of AI-assisted clinical handover tasks, prompt optimisation consistently improved matched model performance and was most promising for bounded checklist prediction and SBAR span extraction. The results support an implementation pathway in which AI outputs are presented as clinician-reviewed, source-linked prompts that shape handover dialogue in real time, rather than as autonomous summary generation. Broad uncertainty detection remained insufficiently reliable, while explicit unknown-fact extraction suggests a narrower but important role for prompting clarification when missing knowledge is directly expressed. Ultimately, the most useful function may be identifying what has not been said, rather than restructuring what has. Before clinical deployment, these approaches require external validation on real handover audio and transcripts, end-to-end testing of transcription and diarisation effects, local calibration of checklist definitions, human-factors evaluation of trust, reliance, workflow burden, and downstream safety outcomes, and structured assessment of organisational readiness for AI implementation in nursing care</w:t>
-      </w:r>
-      <w:r>
-        <w:t xml:space="preserve"> </w:t>
-      </w:r>
-      <w:r>
-        <w:t xml:space="preserve">(Seibert et al. 2026)</w:t>
-      </w:r>
-      <w:r>
-        <w:t xml:space="preserve">.</w:t>
-      </w:r>
-      <w:bookmarkEnd w:id="49"/>
-      <w:bookmarkEnd w:id="50"/>
+        <w:t xml:space="preserve">The authors used OpenAI ChatGPT/Codex during manuscript preparation to assist with editing, formatting, and generation of tables and figures to present results. The authors reviewed, verified, and approved all analytic decisions, references, and final manuscript text.</w:t>
+      </w:r>
+      <w:bookmarkEnd w:id="52"/>
     </w:p>
     <w:p>
       <w:pPr>
         <w:pStyle w:val="Heading2"/>
       </w:pPr>
-      <w:bookmarkStart w:id="51" w:name="sec-acknowledgments"/>
-      <w:r>
-        <w:t xml:space="preserve">Acknowledgments</w:t>
+      <w:bookmarkStart w:id="53" w:name="sec-funding"/>
+      <w:r>
+        <w:t xml:space="preserve">Funding</w:t>
       </w:r>
     </w:p>
     <w:p>
@@ -1606,17 +1754,17 @@
         <w:pStyle w:val="FirstParagraph"/>
       </w:pPr>
       <w:r>
-        <w:t xml:space="preserve">The authors used OpenAI ChatGPT/Codex during manuscript preparation to assist with editing, formatting, and generation of tables and figures to present results. The authors reviewed, verified, and approved all analytic decisions, references, and final manuscript text.</w:t>
-      </w:r>
-      <w:bookmarkEnd w:id="51"/>
+        <w:t xml:space="preserve">This work was supported by The Prince Charles Hospital Foundation Collaboration Grant. The funder had no role in study design, data collection, analysis, interpretation, manuscript preparation, and the decision to submit.</w:t>
+      </w:r>
+      <w:bookmarkEnd w:id="53"/>
     </w:p>
     <w:p>
       <w:pPr>
         <w:pStyle w:val="Heading2"/>
       </w:pPr>
-      <w:bookmarkStart w:id="52" w:name="sec-funding"/>
-      <w:r>
-        <w:t xml:space="preserve">Funding</w:t>
+      <w:bookmarkStart w:id="54" w:name="sec-conflicts"/>
+      <w:r>
+        <w:t xml:space="preserve">Conflicts of Interest</w:t>
       </w:r>
     </w:p>
     <w:p>
@@ -1624,17 +1772,17 @@
         <w:pStyle w:val="FirstParagraph"/>
       </w:pPr>
       <w:r>
-        <w:t xml:space="preserve">This work was supported by The Prince Charles Hospital Foundation Collaboration Grant. The funder had no role in study design, data collection, analysis, interpretation, manuscript preparation, and the decision to submit.</w:t>
-      </w:r>
-      <w:bookmarkEnd w:id="52"/>
+        <w:t xml:space="preserve">The authors declare no conflicts of interest.</w:t>
+      </w:r>
+      <w:bookmarkEnd w:id="54"/>
     </w:p>
     <w:p>
       <w:pPr>
         <w:pStyle w:val="Heading2"/>
       </w:pPr>
-      <w:bookmarkStart w:id="53" w:name="sec-conflicts"/>
-      <w:r>
-        <w:t xml:space="preserve">Conflicts of Interest</w:t>
+      <w:bookmarkStart w:id="56" w:name="sec-data-availability"/>
+      <w:r>
+        <w:t xml:space="preserve">Data Availability</w:t>
       </w:r>
     </w:p>
     <w:p>
@@ -1642,17 +1790,31 @@
         <w:pStyle w:val="FirstParagraph"/>
       </w:pPr>
       <w:r>
-        <w:t xml:space="preserve">The authors declare no conflicts of interest.</w:t>
-      </w:r>
-      <w:bookmarkEnd w:id="53"/>
+        <w:t xml:space="preserve">The synthetic handover transcripts, annotation schema, evaluation outputs, and analysis code are available in a public repository on Figshare at</w:t>
+      </w:r>
+      <w:r>
+        <w:t xml:space="preserve"> </w:t>
+      </w:r>
+      <w:hyperlink ns1:id="rId55">
+        <w:r>
+          <w:rPr>
+            <w:rStyle w:val="Hyperlink"/>
+          </w:rPr>
+          <w:t xml:space="preserve">https://doi.org/10.6084/m9.figshare.32658084</w:t>
+        </w:r>
+      </w:hyperlink>
+      <w:r>
+        <w:t xml:space="preserve">. The NICTA Synthetic Nursing Handover Dataset is publicly available from its original source.</w:t>
+      </w:r>
+      <w:bookmarkEnd w:id="56"/>
     </w:p>
     <w:p>
       <w:pPr>
         <w:pStyle w:val="Heading2"/>
       </w:pPr>
-      <w:bookmarkStart w:id="54" w:name="sec-data-availability"/>
-      <w:r>
-        <w:t xml:space="preserve">Data Availability</w:t>
+      <w:bookmarkStart w:id="57" w:name="sec-author-contributions"/>
+      <w:r>
+        <w:t xml:space="preserve">Authors’ Contributions</w:t>
       </w:r>
     </w:p>
     <w:p>
@@ -1660,33 +1822,15 @@
         <w:pStyle w:val="FirstParagraph"/>
       </w:pPr>
       <w:r>
-        <w:t xml:space="preserve">The synthetic handover transcripts, annotation schema, evaluation outputs, and analysis code are available in a public repository at [doi://10.6084/m9.figshare.32658084] before publication. The NICTA Synthetic Nursing Handover Dataset is publicly available from its original source.</w:t>
-      </w:r>
-      <w:bookmarkEnd w:id="54"/>
+        <w:t xml:space="preserve">Conceptualization: AC, AT. Data curation: AC. Formal analysis: AC. Investigation: AC, AH, JS. Methodology: AC, AH, AT, DL, KD. Project administration: AC. Software: AC. Visualization: AC. Writing - original draft: AC. Writing - review and editing: AC, AH, JS, GX, DL, TM, KD, AT.</w:t>
+      </w:r>
+      <w:bookmarkEnd w:id="57"/>
     </w:p>
     <w:p>
       <w:pPr>
         <w:pStyle w:val="Heading2"/>
       </w:pPr>
-      <w:bookmarkStart w:id="55" w:name="sec-author-contributions"/>
-      <w:r>
-        <w:t xml:space="preserve">Authors’ Contributions</w:t>
-      </w:r>
-    </w:p>
-    <w:p>
-      <w:pPr>
-        <w:pStyle w:val="FirstParagraph"/>
-      </w:pPr>
-      <w:r>
-        <w:t xml:space="preserve">Conceptualization: AC, AT. Data curation: AC. Formal analysis: AC. Investigation: AC, AH, JS. Methodology: AC, AH, AT, DL, KD. Project administration: AC. Software: AC. Visualization: AC. Writing - original draft: AC. Writing - review and editing: AC, AH, JS, GX, DL, TM, KD, AT.</w:t>
-      </w:r>
-      <w:bookmarkEnd w:id="55"/>
-    </w:p>
-    <w:p>
-      <w:pPr>
-        <w:pStyle w:val="Heading2"/>
-      </w:pPr>
-      <w:bookmarkStart w:id="56" w:name="sec-abbreviations"/>
+      <w:bookmarkStart w:id="58" w:name="sec-abbreviations"/>
       <w:r>
         <w:t xml:space="preserve">Abbreviations</w:t>
       </w:r>
@@ -2151,13 +2295,13 @@
       <w:r>
         <w:br w:type="page"/>
       </w:r>
-      <w:bookmarkEnd w:id="56"/>
+      <w:bookmarkEnd w:id="58"/>
     </w:p>
     <w:p>
       <w:pPr>
         <w:pStyle w:val="Heading1"/>
       </w:pPr>
-      <w:bookmarkStart w:id="134" w:name="references"/>
+      <w:bookmarkStart w:id="158" w:name="references"/>
       <w:r>
         <w:t xml:space="preserve">References</w:t>
       </w:r>
@@ -2166,8 +2310,54 @@
       <w:pPr>
         <w:pStyle w:val="Bibliography"/>
       </w:pPr>
-      <w:bookmarkStart w:id="58" w:name="ref-agrawal2025gepa"/>
-      <w:bookmarkStart w:id="124" w:name="refs"/>
+      <w:bookmarkStart w:id="60" w:name="X72c32103699d639f0a17db76202a78fd51b0655"/>
+      <w:bookmarkStart w:id="148" w:name="refs"/>
+      <w:r>
+        <w:t xml:space="preserve">Agha-Mir-Salim, Louis, Isabelle Rose Alberto, Nicole Rose Alberto, et al. 2025.</w:t>
+      </w:r>
+      <w:r>
+        <w:t xml:space="preserve"> </w:t>
+      </w:r>
+      <w:r>
+        <w:t xml:space="preserve">“Technological Solutions to Improve Inpatient Handover in the Era of Artificial Intelligence: Scoping Review.”</w:t>
+      </w:r>
+      <w:r>
+        <w:t xml:space="preserve"> </w:t>
+      </w:r>
+      <w:r>
+        <w:rPr>
+          <w:i/>
+          <w:iCs/>
+        </w:rPr>
+        <w:t xml:space="preserve">J Med Internet Res</w:t>
+      </w:r>
+      <w:r>
+        <w:t xml:space="preserve"> </w:t>
+      </w:r>
+      <w:r>
+        <w:t xml:space="preserve">27 (July): e70358.</w:t>
+      </w:r>
+      <w:r>
+        <w:t xml:space="preserve"> </w:t>
+      </w:r>
+      <w:hyperlink ns1:id="rId59">
+        <w:r>
+          <w:rPr>
+            <w:rStyle w:val="Hyperlink"/>
+          </w:rPr>
+          <w:t xml:space="preserve">https://doi.org/10.2196/70358</w:t>
+        </w:r>
+      </w:hyperlink>
+      <w:r>
+        <w:t xml:space="preserve">.</w:t>
+      </w:r>
+      <w:bookmarkEnd w:id="60"/>
+    </w:p>
+    <w:p>
+      <w:pPr>
+        <w:pStyle w:val="Bibliography"/>
+      </w:pPr>
+      <w:bookmarkStart w:id="62" w:name="ref-agrawal2025gepa"/>
       <w:r>
         <w:t xml:space="preserve">Agrawal, Lakshya A., Shangyin Tan, Dilara Soylu, et al. 2025.</w:t>
       </w:r>
@@ -2194,7 +2384,7 @@
       <w:r>
         <w:t xml:space="preserve"> </w:t>
       </w:r>
-      <w:hyperlink ns1:id="rId57">
+      <w:hyperlink ns1:id="rId61">
         <w:r>
           <w:rPr>
             <w:rStyle w:val="Hyperlink"/>
@@ -2205,13 +2395,144 @@
       <w:r>
         <w:t xml:space="preserve">.</w:t>
       </w:r>
-      <w:bookmarkEnd w:id="58"/>
+      <w:bookmarkEnd w:id="62"/>
     </w:p>
     <w:p>
       <w:pPr>
         <w:pStyle w:val="Bibliography"/>
       </w:pPr>
-      <w:bookmarkStart w:id="60" w:name="ref-bukoh2020structured_handover_review"/>
+      <w:bookmarkStart w:id="64" w:name="ref-agrawal-etal-2022-large"/>
+      <w:r>
+        <w:t xml:space="preserve">Agrawal, Monica, Stefan Hegselmann, Hunter Lang, Yoon Kim, and David Sontag. 2022.</w:t>
+      </w:r>
+      <w:r>
+        <w:t xml:space="preserve"> </w:t>
+      </w:r>
+      <w:r>
+        <w:t xml:space="preserve">“Large Language Models Are Few-Shot Clinical Information Extractors.”</w:t>
+      </w:r>
+      <w:r>
+        <w:t xml:space="preserve"> </w:t>
+      </w:r>
+      <w:r>
+        <w:rPr>
+          <w:i/>
+          <w:iCs/>
+        </w:rPr>
+        <w:t xml:space="preserve">Proceedings of the 2022 Conference on Empirical Methods in Natural Language Processing</w:t>
+      </w:r>
+      <w:r>
+        <w:t xml:space="preserve"> </w:t>
+      </w:r>
+      <w:r>
+        <w:t xml:space="preserve">(Abu Dhabi, United Arab Emirates), December, 1998–2022.</w:t>
+      </w:r>
+      <w:r>
+        <w:t xml:space="preserve"> </w:t>
+      </w:r>
+      <w:hyperlink ns1:id="rId63">
+        <w:r>
+          <w:rPr>
+            <w:rStyle w:val="Hyperlink"/>
+          </w:rPr>
+          <w:t xml:space="preserve">https://doi.org/10.18653/v1/2022.emnlp-main.130</w:t>
+        </w:r>
+      </w:hyperlink>
+      <w:r>
+        <w:t xml:space="preserve">.</w:t>
+      </w:r>
+      <w:bookmarkEnd w:id="64"/>
+    </w:p>
+    <w:p>
+      <w:pPr>
+        <w:pStyle w:val="Bibliography"/>
+      </w:pPr>
+      <w:bookmarkStart w:id="66" w:name="ref-anshasi2024bedside_handover"/>
+      <w:r>
+        <w:t xml:space="preserve">Anshasi, Huda, and Zainab Abdullah Almayasi. 2024.</w:t>
+      </w:r>
+      <w:r>
+        <w:t xml:space="preserve"> </w:t>
+      </w:r>
+      <w:r>
+        <w:t xml:space="preserve">“Perceptions of Patients and Nurses about Bedside Nursing Handover: A Qualitative Systematic Review and Meta-Synthesis.”</w:t>
+      </w:r>
+      <w:r>
+        <w:t xml:space="preserve"> </w:t>
+      </w:r>
+      <w:r>
+        <w:rPr>
+          <w:i/>
+          <w:iCs/>
+        </w:rPr>
+        <w:t xml:space="preserve">Nursing Research and Practice</w:t>
+      </w:r>
+      <w:r>
+        <w:t xml:space="preserve"> </w:t>
+      </w:r>
+      <w:r>
+        <w:t xml:space="preserve">2024: 3208747.</w:t>
+      </w:r>
+      <w:r>
+        <w:t xml:space="preserve"> </w:t>
+      </w:r>
+      <w:hyperlink ns1:id="rId65">
+        <w:r>
+          <w:rPr>
+            <w:rStyle w:val="Hyperlink"/>
+          </w:rPr>
+          <w:t xml:space="preserve">https://doi.org/10.1155/2024/3208747</w:t>
+        </w:r>
+      </w:hyperlink>
+      <w:r>
+        <w:t xml:space="preserve">.</w:t>
+      </w:r>
+      <w:bookmarkEnd w:id="66"/>
+    </w:p>
+    <w:p>
+      <w:pPr>
+        <w:pStyle w:val="Bibliography"/>
+      </w:pPr>
+      <w:bookmarkStart w:id="68" w:name="ref-acsqhc_nsqhs_comm_at_handover"/>
+      <w:r>
+        <w:t xml:space="preserve">Australian Commission on Safety and Quality in Health Care. 2026.</w:t>
+      </w:r>
+      <w:r>
+        <w:t xml:space="preserve"> </w:t>
+      </w:r>
+      <w:r>
+        <w:t xml:space="preserve">“Further Information on Communicating for Safety.”</w:t>
+      </w:r>
+      <w:r>
+        <w:t xml:space="preserve"> </w:t>
+      </w:r>
+      <w:r>
+        <w:t xml:space="preserve">Australian Commission on Safety and Quality in Health Care</w:t>
+      </w:r>
+      <w:r>
+        <w:t xml:space="preserve">, April 29.</w:t>
+      </w:r>
+      <w:r>
+        <w:t xml:space="preserve"> </w:t>
+      </w:r>
+      <w:hyperlink ns1:id="rId67">
+        <w:r>
+          <w:rPr>
+            <w:rStyle w:val="Hyperlink"/>
+          </w:rPr>
+          <w:t xml:space="preserve">https://www.safetyandquality.gov.au/national-standards/nsqhs-standards/communicating-safety-standard/further-information-communicating-safety</w:t>
+        </w:r>
+      </w:hyperlink>
+      <w:r>
+        <w:t xml:space="preserve">.</w:t>
+      </w:r>
+      <w:bookmarkEnd w:id="68"/>
+    </w:p>
+    <w:p>
+      <w:pPr>
+        <w:pStyle w:val="Bibliography"/>
+      </w:pPr>
+      <w:bookmarkStart w:id="70" w:name="ref-bukoh2020structured_handover_review"/>
       <w:r>
         <w:t xml:space="preserve">Bukoh, Ming Xuan, and Chiew-Jiat Rosalind Siah. 2020.</w:t>
       </w:r>
@@ -2240,7 +2561,7 @@
       <w:r>
         <w:t xml:space="preserve"> </w:t>
       </w:r>
-      <w:hyperlink ns1:id="rId59">
+      <w:hyperlink ns1:id="rId69">
         <w:r>
           <w:rPr>
             <w:rStyle w:val="Hyperlink"/>
@@ -2251,13 +2572,13 @@
       <w:r>
         <w:t xml:space="preserve">.</w:t>
       </w:r>
-      <w:bookmarkEnd w:id="60"/>
+      <w:bookmarkEnd w:id="70"/>
     </w:p>
     <w:p>
       <w:pPr>
         <w:pStyle w:val="Bibliography"/>
       </w:pPr>
-      <w:bookmarkStart w:id="62" w:name="ref-challen2019ai_bias_safety"/>
+      <w:bookmarkStart w:id="72" w:name="ref-challen2019ai_bias_safety"/>
       <w:r>
         <w:t xml:space="preserve">Challen, Robert, Joshua Denny, Martin Pitt, Luke Gompels, Tom Edwards, and Krasimira Tsaneva-Atanasova. 2019.</w:t>
       </w:r>
@@ -2286,7 +2607,7 @@
       <w:r>
         <w:t xml:space="preserve"> </w:t>
       </w:r>
-      <w:hyperlink ns1:id="rId61">
+      <w:hyperlink ns1:id="rId71">
         <w:r>
           <w:rPr>
             <w:rStyle w:val="Hyperlink"/>
@@ -2297,13 +2618,59 @@
       <w:r>
         <w:t xml:space="preserve">.</w:t>
       </w:r>
-      <w:bookmarkEnd w:id="62"/>
+      <w:bookmarkEnd w:id="72"/>
     </w:p>
     <w:p>
       <w:pPr>
         <w:pStyle w:val="Bibliography"/>
       </w:pPr>
-      <w:bookmarkStart w:id="64" w:name="Xfc78e3c54764ac25ad9b922ccb4ada8dd697a7d"/>
+      <w:bookmarkStart w:id="74" w:name="ref-chen2026llm_nursing_handover"/>
+      <w:r>
+        <w:t xml:space="preserve">Chen, Ray-Jade, Mai-Szu Wu, Lung-Wen Tsai, Shy-Shin Chang, Shu-Tai Shen Hsiao, and Yu-Sheng Lo. 2026.</w:t>
+      </w:r>
+      <w:r>
+        <w:t xml:space="preserve"> </w:t>
+      </w:r>
+      <w:r>
+        <w:t xml:space="preserve">“Integrating a Large Language Model to Streamline Nursing Handover Documentation Across Multiple Hospitals in Taiwan: Development and Implementation Study.”</w:t>
+      </w:r>
+      <w:r>
+        <w:t xml:space="preserve"> </w:t>
+      </w:r>
+      <w:r>
+        <w:rPr>
+          <w:i/>
+          <w:iCs/>
+        </w:rPr>
+        <w:t xml:space="preserve">Journal of Medical Internet Research</w:t>
+      </w:r>
+      <w:r>
+        <w:t xml:space="preserve"> </w:t>
+      </w:r>
+      <w:r>
+        <w:t xml:space="preserve">28: e81604.</w:t>
+      </w:r>
+      <w:r>
+        <w:t xml:space="preserve"> </w:t>
+      </w:r>
+      <w:hyperlink ns1:id="rId73">
+        <w:r>
+          <w:rPr>
+            <w:rStyle w:val="Hyperlink"/>
+          </w:rPr>
+          <w:t xml:space="preserve">https://doi.org/10.2196/81604</w:t>
+        </w:r>
+      </w:hyperlink>
+      <w:r>
+        <w:t xml:space="preserve">.</w:t>
+      </w:r>
+      <w:bookmarkEnd w:id="74"/>
+    </w:p>
+    <w:p>
+      <w:pPr>
+        <w:pStyle w:val="Bibliography"/>
+      </w:pPr>
+      <w:bookmarkStart w:id="76" w:name="Xfc78e3c54764ac25ad9b922ccb4ada8dd697a7d"/>
       <w:r>
         <w:t xml:space="preserve">Chen, Yukun, Thomas A. Lasko, Qiaozhu Mei, Joshua C. Denny, and Hua Xu. 2015.</w:t>
       </w:r>
@@ -2332,7 +2699,7 @@
       <w:r>
         <w:t xml:space="preserve"> </w:t>
       </w:r>
-      <w:hyperlink ns1:id="rId63">
+      <w:hyperlink ns1:id="rId75">
         <w:r>
           <w:rPr>
             <w:rStyle w:val="Hyperlink"/>
@@ -2343,13 +2710,59 @@
       <w:r>
         <w:t xml:space="preserve">.</w:t>
       </w:r>
-      <w:bookmarkEnd w:id="64"/>
+      <w:bookmarkEnd w:id="76"/>
     </w:p>
     <w:p>
       <w:pPr>
         <w:pStyle w:val="Bibliography"/>
       </w:pPr>
-      <w:bookmarkStart w:id="66" w:name="ref-cohen2010handoffs_literature_review"/>
+      <w:bookmarkStart w:id="78" w:name="ref-chien2024ward_handover_intervention"/>
+      <w:r>
+        <w:t xml:space="preserve">Chien, Laura J., Diana Slade, Liza Goncharov, et al. 2024.</w:t>
+      </w:r>
+      <w:r>
+        <w:t xml:space="preserve"> </w:t>
+      </w:r>
+      <w:r>
+        <w:t xml:space="preserve">“Implementing a Ward-Level Intervention to Improve Nursing Handover Communication with a Focus on Bedside Handover—a Qualitative Study.”</w:t>
+      </w:r>
+      <w:r>
+        <w:t xml:space="preserve"> </w:t>
+      </w:r>
+      <w:r>
+        <w:rPr>
+          <w:i/>
+          <w:iCs/>
+        </w:rPr>
+        <w:t xml:space="preserve">Journal of Clinical Nursing</w:t>
+      </w:r>
+      <w:r>
+        <w:t xml:space="preserve"> </w:t>
+      </w:r>
+      <w:r>
+        <w:t xml:space="preserve">33 (7): 2688–706.</w:t>
+      </w:r>
+      <w:r>
+        <w:t xml:space="preserve"> </w:t>
+      </w:r>
+      <w:hyperlink ns1:id="rId77">
+        <w:r>
+          <w:rPr>
+            <w:rStyle w:val="Hyperlink"/>
+          </w:rPr>
+          <w:t xml:space="preserve">https://doi.org/10.1111/jocn.17107</w:t>
+        </w:r>
+      </w:hyperlink>
+      <w:r>
+        <w:t xml:space="preserve">.</w:t>
+      </w:r>
+      <w:bookmarkEnd w:id="78"/>
+    </w:p>
+    <w:p>
+      <w:pPr>
+        <w:pStyle w:val="Bibliography"/>
+      </w:pPr>
+      <w:bookmarkStart w:id="80" w:name="ref-cohen2010handoffs_literature_review"/>
       <w:r>
         <w:t xml:space="preserve">Cohen, Michael D., and P. Brian Hilligoss. 2010.</w:t>
       </w:r>
@@ -2378,7 +2791,7 @@
       <w:r>
         <w:t xml:space="preserve"> </w:t>
       </w:r>
-      <w:hyperlink ns1:id="rId65">
+      <w:hyperlink ns1:id="rId79">
         <w:r>
           <w:rPr>
             <w:rStyle w:val="Hyperlink"/>
@@ -2389,13 +2802,13 @@
       <w:r>
         <w:t xml:space="preserve">.</w:t>
       </w:r>
-      <w:bookmarkEnd w:id="66"/>
+      <w:bookmarkEnd w:id="80"/>
     </w:p>
     <w:p>
       <w:pPr>
         <w:pStyle w:val="Bibliography"/>
       </w:pPr>
-      <w:bookmarkStart w:id="68" w:name="X9132c3274d89c33a89fcf84fdcda1d990f62191"/>
+      <w:bookmarkStart w:id="82" w:name="X9132c3274d89c33a89fcf84fdcda1d990f62191"/>
       <w:r>
         <w:t xml:space="preserve">Feng, Jean, Rachael V. Phillips, Ivana Malenica, et al. 2022.</w:t>
       </w:r>
@@ -2424,7 +2837,7 @@
       <w:r>
         <w:t xml:space="preserve"> </w:t>
       </w:r>
-      <w:hyperlink ns1:id="rId67">
+      <w:hyperlink ns1:id="rId81">
         <w:r>
           <w:rPr>
             <w:rStyle w:val="Hyperlink"/>
@@ -2435,13 +2848,13 @@
       <w:r>
         <w:t xml:space="preserve">.</w:t>
       </w:r>
-      <w:bookmarkEnd w:id="68"/>
+      <w:bookmarkEnd w:id="82"/>
     </w:p>
     <w:p>
       <w:pPr>
         <w:pStyle w:val="Bibliography"/>
       </w:pPr>
-      <w:bookmarkStart w:id="70" w:name="Xb14394c0fd3ce505ac632388b5ece99a6619c04"/>
+      <w:bookmarkStart w:id="84" w:name="Xb14394c0fd3ce505ac632388b5ece99a6619c04"/>
       <w:r>
         <w:t xml:space="preserve">Figueroa, Rosa L., Qing Zeng-Treitler, Long H. Ngo, Sergey Goryachev, and Eduardo Wiechmann. 2012.</w:t>
       </w:r>
@@ -2470,7 +2883,7 @@
       <w:r>
         <w:t xml:space="preserve"> </w:t>
       </w:r>
-      <w:hyperlink ns1:id="rId69">
+      <w:hyperlink ns1:id="rId83">
         <w:r>
           <w:rPr>
             <w:rStyle w:val="Hyperlink"/>
@@ -2481,13 +2894,48 @@
       <w:r>
         <w:t xml:space="preserve">.</w:t>
       </w:r>
-      <w:bookmarkEnd w:id="70"/>
+      <w:bookmarkEnd w:id="84"/>
     </w:p>
     <w:p>
       <w:pPr>
         <w:pStyle w:val="Bibliography"/>
       </w:pPr>
-      <w:bookmarkStart w:id="72" w:name="ref-goddard2012automation_bias"/>
+      <w:bookmarkStart w:id="85" w:name="ref-gallifant2025tripod"/>
+      <w:r>
+        <w:t xml:space="preserve">Gallifant, Jack, Majid Afshar, Saleem Ameen, et al.</w:t>
+      </w:r>
+      <w:r>
+        <w:t xml:space="preserve"> 2025.</w:t>
+      </w:r>
+      <w:r>
+        <w:t xml:space="preserve"> </w:t>
+      </w:r>
+      <w:r>
+        <w:t xml:space="preserve">“The TRIPOD-LLM Reporting Guideline for Studies Using Large Language Models.”</w:t>
+      </w:r>
+      <w:r>
+        <w:t xml:space="preserve"> </w:t>
+      </w:r>
+      <w:r>
+        <w:rPr>
+          <w:i/>
+          <w:iCs/>
+        </w:rPr>
+        <w:t xml:space="preserve">Nature Medicine</w:t>
+      </w:r>
+      <w:r>
+        <w:t xml:space="preserve"> </w:t>
+      </w:r>
+      <w:r>
+        <w:t xml:space="preserve">31 (1): 60–69.</w:t>
+      </w:r>
+      <w:bookmarkEnd w:id="85"/>
+    </w:p>
+    <w:p>
+      <w:pPr>
+        <w:pStyle w:val="Bibliography"/>
+      </w:pPr>
+      <w:bookmarkStart w:id="87" w:name="ref-goddard2012automation_bias"/>
       <w:r>
         <w:t xml:space="preserve">Goddard, Kate, Abdul Roudsari, and Jeremy C. Wyatt. 2012.</w:t>
       </w:r>
@@ -2516,7 +2964,7 @@
       <w:r>
         <w:t xml:space="preserve"> </w:t>
       </w:r>
-      <w:hyperlink ns1:id="rId71">
+      <w:hyperlink ns1:id="rId86">
         <w:r>
           <w:rPr>
             <w:rStyle w:val="Hyperlink"/>
@@ -2527,13 +2975,13 @@
       <w:r>
         <w:t xml:space="preserve">.</w:t>
       </w:r>
-      <w:bookmarkEnd w:id="72"/>
+      <w:bookmarkEnd w:id="87"/>
     </w:p>
     <w:p>
       <w:pPr>
         <w:pStyle w:val="Bibliography"/>
       </w:pPr>
-      <w:bookmarkStart w:id="74" w:name="ref-goel_2026_langextract"/>
+      <w:bookmarkStart w:id="89" w:name="ref-goel_2026_langextract"/>
       <w:r>
         <w:t xml:space="preserve">Goel, Akshay. 2026.</w:t>
       </w:r>
@@ -2553,7 +3001,7 @@
       <w:r>
         <w:t xml:space="preserve"> </w:t>
       </w:r>
-      <w:hyperlink ns1:id="rId73">
+      <w:hyperlink ns1:id="rId88">
         <w:r>
           <w:rPr>
             <w:rStyle w:val="Hyperlink"/>
@@ -2564,13 +3012,59 @@
       <w:r>
         <w:t xml:space="preserve">.</w:t>
       </w:r>
-      <w:bookmarkEnd w:id="74"/>
+      <w:bookmarkEnd w:id="89"/>
     </w:p>
     <w:p>
       <w:pPr>
         <w:pStyle w:val="Bibliography"/>
       </w:pPr>
-      <w:bookmarkStart w:id="76" w:name="ref-haig2006sbar_shared_mental_model"/>
+      <w:bookmarkStart w:id="91" w:name="ref-hada2021nursing_handover"/>
+      <w:r>
+        <w:t xml:space="preserve">Hada, Adriana, Lee V. Jones, Leanne C. Jack, and Fiona Coyer. 2021.</w:t>
+      </w:r>
+      <w:r>
+        <w:t xml:space="preserve"> </w:t>
+      </w:r>
+      <w:r>
+        <w:t xml:space="preserve">“Translating Evidence-Based Nursing Clinical Handover Practice in an Acute Care Setting: A Quasi-Experimental Study.”</w:t>
+      </w:r>
+      <w:r>
+        <w:t xml:space="preserve"> </w:t>
+      </w:r>
+      <w:r>
+        <w:rPr>
+          <w:i/>
+          <w:iCs/>
+        </w:rPr>
+        <w:t xml:space="preserve">Nursing &amp; Health Sciences</w:t>
+      </w:r>
+      <w:r>
+        <w:t xml:space="preserve"> </w:t>
+      </w:r>
+      <w:r>
+        <w:t xml:space="preserve">23 (2): 466–76.</w:t>
+      </w:r>
+      <w:r>
+        <w:t xml:space="preserve"> </w:t>
+      </w:r>
+      <w:hyperlink ns1:id="rId90">
+        <w:r>
+          <w:rPr>
+            <w:rStyle w:val="Hyperlink"/>
+          </w:rPr>
+          <w:t xml:space="preserve">https://doi.org/10.1111/nhs.12836</w:t>
+        </w:r>
+      </w:hyperlink>
+      <w:r>
+        <w:t xml:space="preserve">.</w:t>
+      </w:r>
+      <w:bookmarkEnd w:id="91"/>
+    </w:p>
+    <w:p>
+      <w:pPr>
+        <w:pStyle w:val="Bibliography"/>
+      </w:pPr>
+      <w:bookmarkStart w:id="93" w:name="ref-haig2006sbar_shared_mental_model"/>
       <w:r>
         <w:t xml:space="preserve">Haig, Kathleen M., Staci Sutton, and John Whittington. 2006.</w:t>
       </w:r>
@@ -2605,7 +3099,7 @@
       <w:r>
         <w:t xml:space="preserve"> </w:t>
       </w:r>
-      <w:hyperlink ns1:id="rId75">
+      <w:hyperlink ns1:id="rId92">
         <w:r>
           <w:rPr>
             <w:rStyle w:val="Hyperlink"/>
@@ -2616,13 +3110,13 @@
       <w:r>
         <w:t xml:space="preserve">.</w:t>
       </w:r>
-      <w:bookmarkEnd w:id="76"/>
+      <w:bookmarkEnd w:id="93"/>
     </w:p>
     <w:p>
       <w:pPr>
         <w:pStyle w:val="Bibliography"/>
       </w:pPr>
-      <w:bookmarkStart w:id="78" w:name="X3728f771f9e32405ddbc8eb87cb3cf7f23267d9"/>
+      <w:bookmarkStart w:id="95" w:name="X3728f771f9e32405ddbc8eb87cb3cf7f23267d9"/>
       <w:r>
         <w:t xml:space="preserve">Kawamoto, Kensaku, Caitlin A. Houlihan, E. Andrew Balas, and David F. Lobach. 2005.</w:t>
       </w:r>
@@ -2651,7 +3145,7 @@
       <w:r>
         <w:t xml:space="preserve"> </w:t>
       </w:r>
-      <w:hyperlink ns1:id="rId77">
+      <w:hyperlink ns1:id="rId94">
         <w:r>
           <w:rPr>
             <w:rStyle w:val="Hyperlink"/>
@@ -2662,13 +3156,13 @@
       <w:r>
         <w:t xml:space="preserve">.</w:t>
       </w:r>
-      <w:bookmarkEnd w:id="78"/>
+      <w:bookmarkEnd w:id="95"/>
     </w:p>
     <w:p>
       <w:pPr>
         <w:pStyle w:val="Bibliography"/>
       </w:pPr>
-      <w:bookmarkStart w:id="80" w:name="ref-kelly2019clinical_ai_impact"/>
+      <w:bookmarkStart w:id="97" w:name="ref-kelly2019clinical_ai_impact"/>
       <w:r>
         <w:t xml:space="preserve">Kelly, Christopher J., Alan Karthikesalingam, Mustafa Suleyman, Greg Corrado, and Dominic King. 2019.</w:t>
       </w:r>
@@ -2697,7 +3191,7 @@
       <w:r>
         <w:t xml:space="preserve"> </w:t>
       </w:r>
-      <w:hyperlink ns1:id="rId79">
+      <w:hyperlink ns1:id="rId96">
         <w:r>
           <w:rPr>
             <w:rStyle w:val="Hyperlink"/>
@@ -2708,13 +3202,13 @@
       <w:r>
         <w:t xml:space="preserve">.</w:t>
       </w:r>
-      <w:bookmarkEnd w:id="80"/>
+      <w:bookmarkEnd w:id="97"/>
     </w:p>
     <w:p>
       <w:pPr>
         <w:pStyle w:val="Bibliography"/>
       </w:pPr>
-      <w:bookmarkStart w:id="82" w:name="ref-khattab2023dspy"/>
+      <w:bookmarkStart w:id="99" w:name="ref-khattab2023dspy"/>
       <w:r>
         <w:t xml:space="preserve">Khattab, Omar, Arnav Singhvi, Paridhi Maheshwari, et al. 2023.</w:t>
       </w:r>
@@ -2741,7 +3235,7 @@
       <w:r>
         <w:t xml:space="preserve"> </w:t>
       </w:r>
-      <w:hyperlink ns1:id="rId81">
+      <w:hyperlink ns1:id="rId98">
         <w:r>
           <w:rPr>
             <w:rStyle w:val="Hyperlink"/>
@@ -2752,13 +3246,13 @@
       <w:r>
         <w:t xml:space="preserve">.</w:t>
       </w:r>
-      <w:bookmarkEnd w:id="82"/>
+      <w:bookmarkEnd w:id="99"/>
     </w:p>
     <w:p>
       <w:pPr>
         <w:pStyle w:val="Bibliography"/>
       </w:pPr>
-      <w:bookmarkStart w:id="84" w:name="ref-leonard2004human_factor"/>
+      <w:bookmarkStart w:id="101" w:name="ref-leonard2004human_factor"/>
       <w:r>
         <w:t xml:space="preserve">Leonard, Michael, Suzanne Graham, and Doug Bonacum. 2004.</w:t>
       </w:r>
@@ -2787,7 +3281,7 @@
       <w:r>
         <w:t xml:space="preserve"> </w:t>
       </w:r>
-      <w:hyperlink ns1:id="rId83">
+      <w:hyperlink ns1:id="rId100">
         <w:r>
           <w:rPr>
             <w:rStyle w:val="Hyperlink"/>
@@ -2798,13 +3292,13 @@
       <w:r>
         <w:t xml:space="preserve">.</w:t>
       </w:r>
-      <w:bookmarkEnd w:id="84"/>
+      <w:bookmarkEnd w:id="101"/>
     </w:p>
     <w:p>
       <w:pPr>
         <w:pStyle w:val="Bibliography"/>
       </w:pPr>
-      <w:bookmarkStart w:id="86" w:name="ref-manias2016handover_perspectives"/>
+      <w:bookmarkStart w:id="103" w:name="ref-manias2016handover_perspectives"/>
       <w:r>
         <w:t xml:space="preserve">Manias, Elizabeth, Fiona Geddes, Bernadette Watson, Dorothy Jones, and Phillip Della. 2016.</w:t>
       </w:r>
@@ -2833,7 +3327,7 @@
       <w:r>
         <w:t xml:space="preserve"> </w:t>
       </w:r>
-      <w:hyperlink ns1:id="rId85">
+      <w:hyperlink ns1:id="rId102">
         <w:r>
           <w:rPr>
             <w:rStyle w:val="Hyperlink"/>
@@ -2844,13 +3338,13 @@
       <w:r>
         <w:t xml:space="preserve">.</w:t>
       </w:r>
-      <w:bookmarkEnd w:id="86"/>
+      <w:bookmarkEnd w:id="103"/>
     </w:p>
     <w:p>
       <w:pPr>
         <w:pStyle w:val="Bibliography"/>
       </w:pPr>
-      <w:bookmarkStart w:id="88" w:name="ref-manser2011effective_handover"/>
+      <w:bookmarkStart w:id="105" w:name="ref-manser2011effective_handover"/>
       <w:r>
         <w:t xml:space="preserve">Manser, Tanja, and Simon Foster. 2011.</w:t>
       </w:r>
@@ -2879,7 +3373,7 @@
       <w:r>
         <w:t xml:space="preserve"> </w:t>
       </w:r>
-      <w:hyperlink ns1:id="rId87">
+      <w:hyperlink ns1:id="rId104">
         <w:r>
           <w:rPr>
             <w:rStyle w:val="Hyperlink"/>
@@ -2890,13 +3384,68 @@
       <w:r>
         <w:t xml:space="preserve">.</w:t>
       </w:r>
-      <w:bookmarkEnd w:id="88"/>
+      <w:bookmarkEnd w:id="105"/>
     </w:p>
     <w:p>
       <w:pPr>
         <w:pStyle w:val="Bibliography"/>
       </w:pPr>
-      <w:bookmarkStart w:id="90" w:name="ref-montani2018prodigy"/>
+      <w:bookmarkStart w:id="107" w:name="ref-mccarthy2025structured_handoff"/>
+      <w:r>
+        <w:t xml:space="preserve">McCarthy, Sean, Aneesa Motala, Emily Lawson, and Paul G. Shekelle. 2025.</w:t>
+      </w:r>
+      <w:r>
+        <w:t xml:space="preserve"> </w:t>
+      </w:r>
+      <w:r>
+        <w:t xml:space="preserve">“Use of Structured Handoff Protocols for Within-Hospital Unit Transitions: A Systematic Review from Making Healthcare Safer</w:t>
+      </w:r>
+      <w:r>
+        <w:t xml:space="preserve"> </w:t>
+      </w:r>
+      <w:r>
+        <w:t xml:space="preserve">IV</w:t>
+      </w:r>
+      <w:r>
+        <w:t xml:space="preserve">.”</w:t>
+      </w:r>
+      <w:r>
+        <w:t xml:space="preserve"> </w:t>
+      </w:r>
+      <w:r>
+        <w:rPr>
+          <w:i/>
+          <w:iCs/>
+        </w:rPr>
+        <w:t xml:space="preserve">BMJ Quality &amp; Safety</w:t>
+      </w:r>
+      <w:r>
+        <w:t xml:space="preserve"> </w:t>
+      </w:r>
+      <w:r>
+        <w:t xml:space="preserve">34 (10): 680–90.</w:t>
+      </w:r>
+      <w:r>
+        <w:t xml:space="preserve"> </w:t>
+      </w:r>
+      <w:hyperlink ns1:id="rId106">
+        <w:r>
+          <w:rPr>
+            <w:rStyle w:val="Hyperlink"/>
+          </w:rPr>
+          <w:t xml:space="preserve">https://doi.org/10.1136/bmjqs-2024-018385</w:t>
+        </w:r>
+      </w:hyperlink>
+      <w:r>
+        <w:t xml:space="preserve">.</w:t>
+      </w:r>
+      <w:bookmarkEnd w:id="107"/>
+    </w:p>
+    <w:p>
+      <w:pPr>
+        <w:pStyle w:val="Bibliography"/>
+      </w:pPr>
+      <w:bookmarkStart w:id="109" w:name="ref-montani2018prodigy"/>
       <w:r>
         <w:t xml:space="preserve">Montani, Ines, and Matthew Honnibal. 2018.</w:t>
       </w:r>
@@ -2915,7 +3464,7 @@
       <w:r>
         <w:t xml:space="preserve"> </w:t>
       </w:r>
-      <w:hyperlink ns1:id="rId89">
+      <w:hyperlink ns1:id="rId108">
         <w:r>
           <w:rPr>
             <w:rStyle w:val="Hyperlink"/>
@@ -2926,33 +3475,21 @@
       <w:r>
         <w:t xml:space="preserve">.</w:t>
       </w:r>
-      <w:bookmarkEnd w:id="90"/>
+      <w:bookmarkEnd w:id="109"/>
     </w:p>
     <w:p>
       <w:pPr>
         <w:pStyle w:val="Bibliography"/>
       </w:pPr>
-      <w:bookmarkStart w:id="92" w:name="ref-muller2018sbar_systematic_review"/>
-      <w:r>
-        <w:t xml:space="preserve">Müller, M., J. Jürgens, M. Redaèlli, K. Klingberg, W. E. Hautz, and S. Stock. 2018.</w:t>
-      </w:r>
-      <w:r>
-        <w:t xml:space="preserve"> </w:t>
-      </w:r>
-      <w:r>
-        <w:t xml:space="preserve">“Impact of the Communication and Patient Hand-Off Tool</w:t>
-      </w:r>
-      <w:r>
-        <w:t xml:space="preserve"> </w:t>
-      </w:r>
-      <w:r>
-        <w:t xml:space="preserve">SBAR</w:t>
-      </w:r>
-      <w:r>
-        <w:t xml:space="preserve"> </w:t>
-      </w:r>
-      <w:r>
-        <w:t xml:space="preserve">on Patient Safety: A Systematic Review.”</w:t>
+      <w:bookmarkStart w:id="111" w:name="X7a38f85a5a870bf66a0185fb79ee715947e6323"/>
+      <w:r>
+        <w:t xml:space="preserve">Moyo, Patience, Judith Anderson, Karen Francis, and Jessica Biles. 2024.</w:t>
+      </w:r>
+      <w:r>
+        <w:t xml:space="preserve"> </w:t>
+      </w:r>
+      <w:r>
+        <w:t xml:space="preserve">“Exploring the Experiences and Perceptions of the Utilisation of Structured Clinical Handover Frameworks by Nurses Working in Acute Care Settings: A Scoping Review.”</w:t>
       </w:r>
       <w:r>
         <w:t xml:space="preserve"> </w:t>
@@ -2962,35 +3499,72 @@
           <w:i/>
           <w:iCs/>
         </w:rPr>
-        <w:t xml:space="preserve">BMJ Open</w:t>
-      </w:r>
-      <w:r>
-        <w:t xml:space="preserve"> </w:t>
-      </w:r>
-      <w:r>
-        <w:t xml:space="preserve">8 (8): e022202.</w:t>
-      </w:r>
-      <w:r>
-        <w:t xml:space="preserve"> </w:t>
-      </w:r>
-      <w:hyperlink ns1:id="rId91">
+        <w:t xml:space="preserve">Journal of Clinical Nursing</w:t>
+      </w:r>
+      <w:r>
+        <w:t xml:space="preserve"> </w:t>
+      </w:r>
+      <w:r>
+        <w:t xml:space="preserve">33 (11): 4297–313.</w:t>
+      </w:r>
+      <w:r>
+        <w:t xml:space="preserve"> </w:t>
+      </w:r>
+      <w:hyperlink ns1:id="rId110">
         <w:r>
           <w:rPr>
             <w:rStyle w:val="Hyperlink"/>
           </w:rPr>
-          <w:t xml:space="preserve">https://doi.org/10.1136/bmjopen-2018-022202</w:t>
+          <w:t xml:space="preserve">https://doi.org/10.1111/jocn.17430</w:t>
         </w:r>
       </w:hyperlink>
       <w:r>
         <w:t xml:space="preserve">.</w:t>
       </w:r>
-      <w:bookmarkEnd w:id="92"/>
+      <w:bookmarkEnd w:id="111"/>
     </w:p>
     <w:p>
       <w:pPr>
         <w:pStyle w:val="Bibliography"/>
       </w:pPr>
-      <w:bookmarkStart w:id="94" w:name="ref-ong2011handoff_failures"/>
+      <w:bookmarkStart w:id="113" w:name="ref-NHMRC2025NationalStatement"/>
+      <w:r>
+        <w:t xml:space="preserve">National Health and Medical Research Council, Australian Research Council, and Universities Australia. 2025.</w:t>
+      </w:r>
+      <w:r>
+        <w:t xml:space="preserve"> </w:t>
+      </w:r>
+      <w:r>
+        <w:rPr>
+          <w:i/>
+          <w:iCs/>
+        </w:rPr>
+        <w:t xml:space="preserve">National Statement on Ethical Conduct in Human Research</w:t>
+      </w:r>
+      <w:r>
+        <w:t xml:space="preserve">. National Health; Medical Research Council.</w:t>
+      </w:r>
+      <w:r>
+        <w:t xml:space="preserve"> </w:t>
+      </w:r>
+      <w:hyperlink ns1:id="rId112">
+        <w:r>
+          <w:rPr>
+            <w:rStyle w:val="Hyperlink"/>
+          </w:rPr>
+          <w:t xml:space="preserve">https://www.nhmrc.gov.au/about-us/publications/national-statement-ethical-conduct-human-research-2025</w:t>
+        </w:r>
+      </w:hyperlink>
+      <w:r>
+        <w:t xml:space="preserve">.</w:t>
+      </w:r>
+      <w:bookmarkEnd w:id="113"/>
+    </w:p>
+    <w:p>
+      <w:pPr>
+        <w:pStyle w:val="Bibliography"/>
+      </w:pPr>
+      <w:bookmarkStart w:id="115" w:name="ref-ong2011handoff_failures"/>
       <w:r>
         <w:t xml:space="preserve">Ong, Mei-Sing, and Enrico Coiera. 2011.</w:t>
       </w:r>
@@ -3019,7 +3593,7 @@
       <w:r>
         <w:t xml:space="preserve"> </w:t>
       </w:r>
-      <w:hyperlink ns1:id="rId93">
+      <w:hyperlink ns1:id="rId114">
         <w:r>
           <w:rPr>
             <w:rStyle w:val="Hyperlink"/>
@@ -3030,13 +3604,13 @@
       <w:r>
         <w:t xml:space="preserve">.</w:t>
       </w:r>
-      <w:bookmarkEnd w:id="94"/>
+      <w:bookmarkEnd w:id="115"/>
     </w:p>
     <w:p>
       <w:pPr>
         <w:pStyle w:val="Bibliography"/>
       </w:pPr>
-      <w:bookmarkStart w:id="96" w:name="ref-patterson2004handoff_strategies"/>
+      <w:bookmarkStart w:id="117" w:name="ref-patterson2004handoff_strategies"/>
       <w:r>
         <w:t xml:space="preserve">Patterson, Emily S., Emilie M. Roth, David D. Woods, Rebecca Chow, and Joao O. Gomes. 2004.</w:t>
       </w:r>
@@ -3065,7 +3639,7 @@
       <w:r>
         <w:t xml:space="preserve"> </w:t>
       </w:r>
-      <w:hyperlink ns1:id="rId95">
+      <w:hyperlink ns1:id="rId116">
         <w:r>
           <w:rPr>
             <w:rStyle w:val="Hyperlink"/>
@@ -3076,13 +3650,13 @@
       <w:r>
         <w:t xml:space="preserve">.</w:t>
       </w:r>
-      <w:bookmarkEnd w:id="96"/>
+      <w:bookmarkEnd w:id="117"/>
     </w:p>
     <w:p>
       <w:pPr>
         <w:pStyle w:val="Bibliography"/>
       </w:pPr>
-      <w:bookmarkStart w:id="98" w:name="ref-pepito2025automation_nursing"/>
+      <w:bookmarkStart w:id="119" w:name="ref-pepito2025automation_nursing"/>
       <w:r>
         <w:t xml:space="preserve">Pepito, Joseph Andrew, Neilan John Acaso, Rommel Merioles, and Judith Ismael. 2025.</w:t>
       </w:r>
@@ -3125,7 +3699,7 @@
       <w:r>
         <w:t xml:space="preserve"> </w:t>
       </w:r>
-      <w:hyperlink ns1:id="rId97">
+      <w:hyperlink ns1:id="rId118">
         <w:r>
           <w:rPr>
             <w:rStyle w:val="Hyperlink"/>
@@ -3136,13 +3710,13 @@
       <w:r>
         <w:t xml:space="preserve">.</w:t>
       </w:r>
-      <w:bookmarkEnd w:id="98"/>
+      <w:bookmarkEnd w:id="119"/>
     </w:p>
     <w:p>
       <w:pPr>
         <w:pStyle w:val="Bibliography"/>
       </w:pPr>
-      <w:bookmarkStart w:id="100" w:name="ref-redley2018handover_audit_tool"/>
+      <w:bookmarkStart w:id="121" w:name="ref-redley2018handover_audit_tool"/>
       <w:r>
         <w:t xml:space="preserve">Redley, Bernice, and Rachael Waugh. 2018.</w:t>
       </w:r>
@@ -3171,7 +3745,7 @@
       <w:r>
         <w:t xml:space="preserve"> </w:t>
       </w:r>
-      <w:hyperlink ns1:id="rId99">
+      <w:hyperlink ns1:id="rId120">
         <w:r>
           <w:rPr>
             <w:rStyle w:val="Hyperlink"/>
@@ -3182,13 +3756,13 @@
       <w:r>
         <w:t xml:space="preserve">.</w:t>
       </w:r>
-      <w:bookmarkEnd w:id="100"/>
+      <w:bookmarkEnd w:id="121"/>
     </w:p>
     <w:p>
       <w:pPr>
         <w:pStyle w:val="Bibliography"/>
       </w:pPr>
-      <w:bookmarkStart w:id="102" w:name="ref-riesenberg2010nursing_handoffs"/>
+      <w:bookmarkStart w:id="123" w:name="ref-riesenberg2010nursing_handoffs"/>
       <w:r>
         <w:t xml:space="preserve">Riesenberg, Lee Ann, Jessica Leitzsch, and Janet M. Cunningham. 2010.</w:t>
       </w:r>
@@ -3217,7 +3791,7 @@
       <w:r>
         <w:t xml:space="preserve"> </w:t>
       </w:r>
-      <w:hyperlink ns1:id="rId101">
+      <w:hyperlink ns1:id="rId122">
         <w:r>
           <w:rPr>
             <w:rStyle w:val="Hyperlink"/>
@@ -3228,13 +3802,13 @@
       <w:r>
         <w:t xml:space="preserve">.</w:t>
       </w:r>
-      <w:bookmarkEnd w:id="102"/>
+      <w:bookmarkEnd w:id="123"/>
     </w:p>
     <w:p>
       <w:pPr>
         <w:pStyle w:val="Bibliography"/>
       </w:pPr>
-      <w:bookmarkStart w:id="104" w:name="ref-ronquillo2026beyond_time_saved"/>
+      <w:bookmarkStart w:id="125" w:name="ref-ronquillo2026beyond_time_saved"/>
       <w:r>
         <w:t xml:space="preserve">Ronquillo, Charlene E. 2026.</w:t>
       </w:r>
@@ -3263,7 +3837,7 @@
       <w:r>
         <w:t xml:space="preserve"> </w:t>
       </w:r>
-      <w:hyperlink ns1:id="rId103">
+      <w:hyperlink ns1:id="rId124">
         <w:r>
           <w:rPr>
             <w:rStyle w:val="Hyperlink"/>
@@ -3274,13 +3848,13 @@
       <w:r>
         <w:t xml:space="preserve">.</w:t>
       </w:r>
-      <w:bookmarkEnd w:id="104"/>
+      <w:bookmarkEnd w:id="125"/>
     </w:p>
     <w:p>
       <w:pPr>
         <w:pStyle w:val="Bibliography"/>
       </w:pPr>
-      <w:bookmarkStart w:id="106" w:name="X84f504fe36723ac26e1d446c978b4ea4e7cbf1d"/>
+      <w:bookmarkStart w:id="127" w:name="X84f504fe36723ac26e1d446c978b4ea4e7cbf1d"/>
       <w:r>
         <w:t xml:space="preserve">Rosenbloom, S. Trent, Joshua C. Denny, Hua Xu, Nancy Lorenzi, William W. Stead, and Kevin B. Johnson. 2011.</w:t>
       </w:r>
@@ -3309,7 +3883,7 @@
       <w:r>
         <w:t xml:space="preserve"> </w:t>
       </w:r>
-      <w:hyperlink ns1:id="rId105">
+      <w:hyperlink ns1:id="rId126">
         <w:r>
           <w:rPr>
             <w:rStyle w:val="Hyperlink"/>
@@ -3320,13 +3894,13 @@
       <w:r>
         <w:t xml:space="preserve">.</w:t>
       </w:r>
-      <w:bookmarkEnd w:id="106"/>
+      <w:bookmarkEnd w:id="127"/>
     </w:p>
     <w:p>
       <w:pPr>
         <w:pStyle w:val="Bibliography"/>
       </w:pPr>
-      <w:bookmarkStart w:id="108" w:name="ref-seibert2026aincra"/>
+      <w:bookmarkStart w:id="129" w:name="ref-seibert2026aincra"/>
       <w:r>
         <w:t xml:space="preserve">Seibert, Kathrin, Dominik Domhoff, Janissa Altona, et al. 2026.</w:t>
       </w:r>
@@ -3381,7 +3955,7 @@
       <w:r>
         <w:t xml:space="preserve"> </w:t>
       </w:r>
-      <w:hyperlink ns1:id="rId107">
+      <w:hyperlink ns1:id="rId128">
         <w:r>
           <w:rPr>
             <w:rStyle w:val="Hyperlink"/>
@@ -3392,13 +3966,13 @@
       <w:r>
         <w:t xml:space="preserve">.</w:t>
       </w:r>
-      <w:bookmarkEnd w:id="108"/>
+      <w:bookmarkEnd w:id="129"/>
     </w:p>
     <w:p>
       <w:pPr>
         <w:pStyle w:val="Bibliography"/>
       </w:pPr>
-      <w:bookmarkStart w:id="110" w:name="Xd5ad661bd09fe0c6abbf39ed47254bc90557097"/>
+      <w:bookmarkStart w:id="131" w:name="Xd5ad661bd09fe0c6abbf39ed47254bc90557097"/>
       <w:r>
         <w:t xml:space="preserve">Sellergren, Andrew, Sahar Kazemzadeh, Tiam Jaroensri, et al. 2025.</w:t>
       </w:r>
@@ -3418,7 +3992,7 @@
       <w:r>
         <w:t xml:space="preserve"> </w:t>
       </w:r>
-      <w:hyperlink ns1:id="rId109">
+      <w:hyperlink ns1:id="rId130">
         <w:r>
           <w:rPr>
             <w:rStyle w:val="Hyperlink"/>
@@ -3429,13 +4003,13 @@
       <w:r>
         <w:t xml:space="preserve">.</w:t>
       </w:r>
-      <w:bookmarkEnd w:id="110"/>
+      <w:bookmarkEnd w:id="131"/>
     </w:p>
     <w:p>
       <w:pPr>
         <w:pStyle w:val="Bibliography"/>
       </w:pPr>
-      <w:bookmarkStart w:id="112" w:name="ref-singh2025openaigpt5card"/>
+      <w:bookmarkStart w:id="133" w:name="ref-singh2025openaigpt5card"/>
       <w:r>
         <w:t xml:space="preserve">Singh, Aaditya, Adam Fry, Adam Perelman, et al. 2025.</w:t>
       </w:r>
@@ -3455,7 +4029,7 @@
       <w:r>
         <w:t xml:space="preserve"> </w:t>
       </w:r>
-      <w:hyperlink ns1:id="rId111">
+      <w:hyperlink ns1:id="rId132">
         <w:r>
           <w:rPr>
             <w:rStyle w:val="Hyperlink"/>
@@ -3466,13 +4040,13 @@
       <w:r>
         <w:t xml:space="preserve">.</w:t>
       </w:r>
-      <w:bookmarkEnd w:id="112"/>
+      <w:bookmarkEnd w:id="133"/>
     </w:p>
     <w:p>
       <w:pPr>
         <w:pStyle w:val="Bibliography"/>
       </w:pPr>
-      <w:bookmarkStart w:id="114" w:name="ref-sittig2010sociotechnical_model"/>
+      <w:bookmarkStart w:id="135" w:name="ref-sittig2010sociotechnical_model"/>
       <w:r>
         <w:t xml:space="preserve">Sittig, Dean F., and Hardeep Singh. 2010.</w:t>
       </w:r>
@@ -3501,7 +4075,7 @@
       <w:r>
         <w:t xml:space="preserve"> </w:t>
       </w:r>
-      <w:hyperlink ns1:id="rId113">
+      <w:hyperlink ns1:id="rId134">
         <w:r>
           <w:rPr>
             <w:rStyle w:val="Hyperlink"/>
@@ -3512,13 +4086,13 @@
       <w:r>
         <w:t xml:space="preserve">.</w:t>
       </w:r>
-      <w:bookmarkEnd w:id="114"/>
+      <w:bookmarkEnd w:id="135"/>
     </w:p>
     <w:p>
       <w:pPr>
         <w:pStyle w:val="Bibliography"/>
       </w:pPr>
-      <w:bookmarkStart w:id="116" w:name="X3e29fdb1f58eb2dde6c0ed41ec5e85b1ca8cf26"/>
+      <w:bookmarkStart w:id="137" w:name="X3e29fdb1f58eb2dde6c0ed41ec5e85b1ca8cf26"/>
       <w:r>
         <w:t xml:space="preserve">Sivarajkumar, Sonish, Mark Kelley, Alyssa Samolyk-Mazzanti, Shyam Visweswaran, and Yanshan Wang. 2024.</w:t>
       </w:r>
@@ -3561,7 +4135,7 @@
       <w:r>
         <w:t xml:space="preserve"> </w:t>
       </w:r>
-      <w:hyperlink ns1:id="rId115">
+      <w:hyperlink ns1:id="rId136">
         <w:r>
           <w:rPr>
             <w:rStyle w:val="Hyperlink"/>
@@ -3572,13 +4146,13 @@
       <w:r>
         <w:t xml:space="preserve">.</w:t>
       </w:r>
-      <w:bookmarkEnd w:id="116"/>
+      <w:bookmarkEnd w:id="137"/>
     </w:p>
     <w:p>
       <w:pPr>
         <w:pStyle w:val="Bibliography"/>
       </w:pPr>
-      <w:bookmarkStart w:id="118" w:name="ref-starmer2014handoff_program"/>
+      <w:bookmarkStart w:id="139" w:name="ref-starmer2014handoff_program"/>
       <w:r>
         <w:t xml:space="preserve">Starmer, Amy J., Nancy D. Spector, Rajendu Srivastava, et al. 2014.</w:t>
       </w:r>
@@ -3607,7 +4181,7 @@
       <w:r>
         <w:t xml:space="preserve"> </w:t>
       </w:r>
-      <w:hyperlink ns1:id="rId117">
+      <w:hyperlink ns1:id="rId138">
         <w:r>
           <w:rPr>
             <w:rStyle w:val="Hyperlink"/>
@@ -3618,13 +4192,13 @@
       <w:r>
         <w:t xml:space="preserve">.</w:t>
       </w:r>
-      <w:bookmarkEnd w:id="118"/>
+      <w:bookmarkEnd w:id="139"/>
     </w:p>
     <w:p>
       <w:pPr>
         <w:pStyle w:val="Bibliography"/>
       </w:pPr>
-      <w:bookmarkStart w:id="119" w:name="ref-suominen2015benchmarking"/>
+      <w:bookmarkStart w:id="141" w:name="ref-suominen2015benchmarking"/>
       <w:r>
         <w:t xml:space="preserve">Suominen, Hanna, Liyuan Zhou, Leif Hanlen, and Gabriela Ferraro. 2015.</w:t>
       </w:r>
@@ -3642,21 +4216,49 @@
           <w:i/>
           <w:iCs/>
         </w:rPr>
-        <w:t xml:space="preserve">JMIR Medical Informatics</w:t>
-      </w:r>
-      <w:r>
-        <w:t xml:space="preserve"> </w:t>
-      </w:r>
-      <w:r>
-        <w:t xml:space="preserve">3 (2): e4321.</w:t>
-      </w:r>
-      <w:bookmarkEnd w:id="119"/>
+        <w:t xml:space="preserve">JMIR</w:t>
+      </w:r>
+      <w:r>
+        <w:rPr>
+          <w:i/>
+          <w:iCs/>
+        </w:rPr>
+        <w:t xml:space="preserve"> </w:t>
+      </w:r>
+      <w:r>
+        <w:rPr>
+          <w:i/>
+          <w:iCs/>
+        </w:rPr>
+        <w:t xml:space="preserve">Medical Informatics</w:t>
+      </w:r>
+      <w:r>
+        <w:t xml:space="preserve"> </w:t>
+      </w:r>
+      <w:r>
+        <w:t xml:space="preserve">3 (2): e19.</w:t>
+      </w:r>
+      <w:r>
+        <w:t xml:space="preserve"> </w:t>
+      </w:r>
+      <w:hyperlink ns1:id="rId140">
+        <w:r>
+          <w:rPr>
+            <w:rStyle w:val="Hyperlink"/>
+          </w:rPr>
+          <w:t xml:space="preserve">https://doi.org/10.2196/medinform.4321</w:t>
+        </w:r>
+      </w:hyperlink>
+      <w:r>
+        <w:t xml:space="preserve">.</w:t>
+      </w:r>
+      <w:bookmarkEnd w:id="141"/>
     </w:p>
     <w:p>
       <w:pPr>
         <w:pStyle w:val="Bibliography"/>
       </w:pPr>
-      <w:bookmarkStart w:id="121" w:name="X1d1634b0fcd98c37ce6ace6834fc8e61539cd40"/>
+      <w:bookmarkStart w:id="143" w:name="X1d1634b0fcd98c37ce6ace6834fc8e61539cd40"/>
       <w:r>
         <w:t xml:space="preserve">Tobiano, Georgia, Tracey Bucknall, Ishtar Sladdin, Jennifer A. Whitty, and Wendy Chaboyer. 2018.</w:t>
       </w:r>
@@ -3685,7 +4287,7 @@
       <w:r>
         <w:t xml:space="preserve"> </w:t>
       </w:r>
-      <w:hyperlink ns1:id="rId120">
+      <w:hyperlink ns1:id="rId142">
         <w:r>
           <w:rPr>
             <w:rStyle w:val="Hyperlink"/>
@@ -3696,21 +4298,15 @@
       <w:r>
         <w:t xml:space="preserve">.</w:t>
       </w:r>
-      <w:bookmarkEnd w:id="121"/>
+      <w:bookmarkEnd w:id="143"/>
     </w:p>
     <w:p>
       <w:pPr>
         <w:pStyle w:val="Bibliography"/>
       </w:pPr>
-      <w:bookmarkStart w:id="123" w:name="ref-watson2014time_handover"/>
-      <w:r>
-        <w:t xml:space="preserve">Watson, Bernadette M., Liz Jones, and Julia Cretchley. 2014.</w:t>
-      </w:r>
-      <w:r>
-        <w:t xml:space="preserve"> </w:t>
-      </w:r>
-      <w:r>
-        <w:t xml:space="preserve">“Time as a Key Topic in Health Professionals’ Perceptions of Clinical Handovers.”</w:t>
+      <w:bookmarkStart w:id="145" w:name="ref-who2007patient-handover"/>
+      <w:r>
+        <w:t xml:space="preserve">World Health Organization, The Joint Commission, and Joint Commission International. 2007.</w:t>
       </w:r>
       <w:r>
         <w:t xml:space="preserve"> </w:t>
@@ -3720,35 +4316,82 @@
           <w:i/>
           <w:iCs/>
         </w:rPr>
-        <w:t xml:space="preserve">Global Qualitative Nursing Research</w:t>
-      </w:r>
-      <w:r>
-        <w:t xml:space="preserve"> </w:t>
-      </w:r>
-      <w:r>
-        <w:t xml:space="preserve">1 (October): 2333393614550162.</w:t>
-      </w:r>
-      <w:r>
-        <w:t xml:space="preserve"> </w:t>
-      </w:r>
-      <w:hyperlink ns1:id="rId122">
+        <w:t xml:space="preserve">Communication During Patient Hand-Overs</w:t>
+      </w:r>
+      <w:r>
+        <w:t xml:space="preserve">. Patient Safety Solutions Volume 1, Solution 3.</w:t>
+      </w:r>
+      <w:r>
+        <w:t xml:space="preserve"> </w:t>
+      </w:r>
+      <w:r>
+        <w:t xml:space="preserve">World Health Organization</w:t>
+      </w:r>
+      <w:r>
+        <w:t xml:space="preserve">.</w:t>
+      </w:r>
+      <w:r>
+        <w:t xml:space="preserve"> </w:t>
+      </w:r>
+      <w:hyperlink ns1:id="rId144">
         <w:r>
           <w:rPr>
             <w:rStyle w:val="Hyperlink"/>
           </w:rPr>
-          <w:t xml:space="preserve">https://doi.org/10.1177/2333393614550162</w:t>
+          <w:t xml:space="preserve">https://cdn.who.int/media/docs/default-source/patient-safety/patient-safety-solutions/ps-solution3-communication-during-patient-handovers.pdf</w:t>
         </w:r>
       </w:hyperlink>
       <w:r>
         <w:t xml:space="preserve">.</w:t>
       </w:r>
-      <w:bookmarkEnd w:id="123"/>
-      <w:bookmarkEnd w:id="124"/>
-    </w:p>
-    <w:p>
-      <w:r>
-        <w:br w:type="page"/>
-      </w:r>
+      <w:bookmarkEnd w:id="145"/>
+    </w:p>
+    <w:p>
+      <w:pPr>
+        <w:pStyle w:val="Bibliography"/>
+      </w:pPr>
+      <w:bookmarkStart w:id="147" w:name="ref-yung2023handover_mnemonics"/>
+      <w:r>
+        <w:t xml:space="preserve">Yung, A. H. W., C. S. Pak, and B. Watson. 2023.</w:t>
+      </w:r>
+      <w:r>
+        <w:t xml:space="preserve"> </w:t>
+      </w:r>
+      <w:r>
+        <w:t xml:space="preserve">“A Scoping Review of Clinical Handover Mnemonic Devices.”</w:t>
+      </w:r>
+      <w:r>
+        <w:t xml:space="preserve"> </w:t>
+      </w:r>
+      <w:r>
+        <w:rPr>
+          <w:i/>
+          <w:iCs/>
+        </w:rPr>
+        <w:t xml:space="preserve">International Journal for Quality in Health Care</w:t>
+      </w:r>
+      <w:r>
+        <w:t xml:space="preserve"> </w:t>
+      </w:r>
+      <w:r>
+        <w:t xml:space="preserve">35 (3): mzad065.</w:t>
+      </w:r>
+      <w:r>
+        <w:t xml:space="preserve"> </w:t>
+      </w:r>
+      <w:hyperlink ns1:id="rId146">
+        <w:r>
+          <w:rPr>
+            <w:rStyle w:val="Hyperlink"/>
+          </w:rPr>
+          <w:t xml:space="preserve">https://doi.org/10.1093/intqhc/mzad065</w:t>
+        </w:r>
+      </w:hyperlink>
+      <w:r>
+        <w:t xml:space="preserve">.</w:t>
+      </w:r>
+      <w:bookmarkEnd w:id="147"/>
+      <w:bookmarkEnd w:id="148"/>
     </w:p>
     <w:tbl>
       <w:tblPr>
@@ -3763,7 +4406,7 @@
       <w:tr>
         <w:tc>
           <w:tcPr/>
-          <w:bookmarkStart w:id="128" w:name="fig-results-overview"/>
+          <w:bookmarkStart w:id="152" w:name="fig-results-overview"/>
           <w:p>
             <w:pPr>
               <w:pStyle w:val="Compact"/>
@@ -3774,18 +4417,18 @@
                 <ns2:inline>
                   <ns2:extent cx="5943600" cy="2918968"/>
                   <ns2:effectExtent b="0" l="0" r="0" t="0"/>
-                  <ns2:docPr descr="" title="" id="126" name="Picture"/>
+                  <ns2:docPr descr="" title="" id="150" name="Picture"/>
                   <ns3:graphic>
                     <ns3:graphicData uri="http://schemas.openxmlformats.org/drawingml/2006/picture">
                       <ns4:pic>
                         <ns4:nvPicPr>
-                          <ns4:cNvPr descr="manuscript-assets/fig-results-overview.png" id="127" name="Picture"/>
+                          <ns4:cNvPr descr="manuscript-assets/fig-results-overview.png" id="151" name="Picture"/>
                           <ns4:cNvPicPr>
                             <ns3:picLocks noChangeArrowheads="1" noChangeAspect="1"/>
                           </ns4:cNvPicPr>
                         </ns4:nvPicPr>
                         <ns4:blipFill>
-                          <ns3:blip ns1:embed="rId125"/>
+                          <ns3:blip ns1:embed="rId149"/>
                           <ns3:stretch>
                             <ns3:fillRect/>
                           </ns3:stretch>
@@ -3822,7 +4465,7 @@
               <w:t xml:space="preserve">Figure 1: Within-model comparison of saved evaluation runs within manuscript scope. Horizontal bars show micro-F1 for baseline, DSPy/GEPA, and LangExtract runs for each model within each task. Missing bars indicate that a given task-model-approach combination was not evaluated or was not available as a saved run; in particular, LangExtract was not evaluated for the checklist task.</w:t>
             </w:r>
           </w:p>
-          <w:bookmarkEnd w:id="128"/>
+          <w:bookmarkEnd w:id="152"/>
         </w:tc>
       </w:tr>
     </w:tbl>
@@ -3844,7 +4487,7 @@
       <w:tr>
         <w:tc>
           <w:tcPr/>
-          <w:bookmarkStart w:id="129" w:name="tbl-checklist-items"/>
+          <w:bookmarkStart w:id="153" w:name="tbl-checklist-items"/>
           <w:p>
             <w:pPr>
               <w:pStyle w:val="ImageCaption"/>
@@ -4703,7 +5346,7 @@
               </w:tc>
             </w:tr>
           </w:tbl>
-          <w:bookmarkEnd w:id="129"/>
+          <w:bookmarkEnd w:id="153"/>
           <w:p/>
         </w:tc>
       </w:tr>
@@ -4726,7 +5369,7 @@
       <w:tr>
         <w:tc>
           <w:tcPr/>
-          <w:bookmarkStart w:id="130" w:name="tbl-uncertainty-items"/>
+          <w:bookmarkStart w:id="154" w:name="tbl-uncertainty-items"/>
           <w:p>
             <w:pPr>
               <w:pStyle w:val="ImageCaption"/>
@@ -4841,10 +5484,7 @@
                     <w:jc w:val="left"/>
                   </w:pPr>
                   <w:r>
-                    <w:t xml:space="preserve">“I think ENT reviewed him.”</w:t>
-                  </w:r>
-                  <w:r>
-                    <w:t xml:space="preserve">“He should be going to theatre soon.”</w:t>
+                    <w:t xml:space="preserve">“I think ENT reviewed him”; “He should be going to theatre soon.”</w:t>
                   </w:r>
                 </w:p>
               </w:tc>
@@ -4891,10 +5531,7 @@
                     <w:jc w:val="left"/>
                   </w:pPr>
                   <w:r>
-                    <w:t xml:space="preserve">“He looks fine now.”</w:t>
-                  </w:r>
-                  <w:r>
-                    <w:t xml:space="preserve">“Seems okay.”</w:t>
+                    <w:t xml:space="preserve">“He looks fine now”; “Seems okay.”</w:t>
                   </w:r>
                 </w:p>
               </w:tc>
@@ -4941,10 +5578,7 @@
                     <w:jc w:val="left"/>
                   </w:pPr>
                   <w:r>
-                    <w:t xml:space="preserve">“Not sure if consent’s been signed.”</w:t>
-                  </w:r>
-                  <w:r>
-                    <w:t xml:space="preserve">“I don’t know his allergies.”</w:t>
+                    <w:t xml:space="preserve">“Not sure if consent’s been signed”; “I don’t know his allergies.”</w:t>
                   </w:r>
                 </w:p>
               </w:tc>
@@ -4991,10 +5625,7 @@
                     <w:jc w:val="left"/>
                   </w:pPr>
                   <w:r>
-                    <w:t xml:space="preserve">“Later today.”</w:t>
-                  </w:r>
-                  <w:r>
-                    <w:t xml:space="preserve">“After the round.”</w:t>
+                    <w:t xml:space="preserve">“Later today”; “After the round.”</w:t>
                   </w:r>
                 </w:p>
               </w:tc>
@@ -5041,10 +5672,7 @@
                     <w:jc w:val="left"/>
                   </w:pPr>
                   <w:r>
-                    <w:t xml:space="preserve">“ENT said he’s on the list.”</w:t>
-                  </w:r>
-                  <w:r>
-                    <w:t xml:space="preserve">“Night nurse told me.”</w:t>
+                    <w:t xml:space="preserve">“ENT said he’s on the list”; “Night nurse told me.”</w:t>
                   </w:r>
                 </w:p>
               </w:tc>
@@ -5138,16 +5766,13 @@
                     <w:jc w:val="left"/>
                   </w:pPr>
                   <w:r>
-                    <w:t xml:space="preserve">“Bloods to be checked later.”</w:t>
-                  </w:r>
-                  <w:r>
-                    <w:t xml:space="preserve">“Needs review this afternoon.”</w:t>
+                    <w:t xml:space="preserve">“Bloods to be checked later”; “Needs review this afternoon.”</w:t>
                   </w:r>
                 </w:p>
               </w:tc>
             </w:tr>
           </w:tbl>
-          <w:bookmarkEnd w:id="130"/>
+          <w:bookmarkEnd w:id="154"/>
           <w:p/>
         </w:tc>
       </w:tr>
@@ -5174,7 +5799,7 @@
       <w:tr>
         <w:tc>
           <w:tcPr/>
-          <w:bookmarkStart w:id="131" w:name="tbl-sbar-optimized"/>
+          <w:bookmarkStart w:id="155" w:name="tbl-sbar-optimized"/>
           <w:p>
             <w:pPr>
               <w:pStyle w:val="ImageCaption"/>
@@ -5740,7 +6365,7 @@
               </w:tc>
             </w:tr>
           </w:tbl>
-          <w:bookmarkEnd w:id="131"/>
+          <w:bookmarkEnd w:id="155"/>
           <w:p/>
         </w:tc>
       </w:tr>
@@ -5781,7 +6406,7 @@
       <w:tr>
         <w:tc>
           <w:tcPr/>
-          <w:bookmarkStart w:id="132" w:name="tbl-checklist-grouped"/>
+          <w:bookmarkStart w:id="156" w:name="tbl-checklist-grouped"/>
           <w:p>
             <w:pPr>
               <w:pStyle w:val="ImageCaption"/>
@@ -7702,609 +8327,721 @@
                 </w:p>
               </w:tc>
             </w:tr>
-            <w:tr>
-              <w:tc>
-                <w:tcPr>
-                  <w:tcW w:w="3483" w:type="dxa"/>
-                </w:tcPr>
-                <w:p>
-                  <w:pPr>
-                    <w:pStyle w:val="Compact"/>
-                    <w:spacing w:before="0" w:after="0" w:line="240" w:lineRule="auto"/>
-                    <w:jc w:val="left"/>
-                  </w:pPr>
-                  <w:r>
-                    <w:rPr>
-                      <w:b/>
-                      <w:bCs/>
-                    </w:rPr>
-                    <w:t xml:space="preserve">Recommendation</w:t>
-                  </w:r>
-                </w:p>
-              </w:tc>
-              <w:tc>
-                <w:tcPr>
-                  <w:tcW w:w="1108" w:type="dxa"/>
-                </w:tcPr>
-                <w:p>
-                  <w:pPr>
-                    <w:pStyle w:val="Compact"/>
-                    <w:spacing w:before="0" w:after="0" w:line="240" w:lineRule="auto"/>
-                    <w:jc w:val="right"/>
-                  </w:pPr>
-                </w:p>
-              </w:tc>
-              <w:tc>
-                <w:tcPr>
-                  <w:tcW w:w="1108" w:type="dxa"/>
-                </w:tcPr>
-                <w:p>
-                  <w:pPr>
-                    <w:pStyle w:val="Compact"/>
-                    <w:spacing w:before="0" w:after="0" w:line="240" w:lineRule="auto"/>
-                    <w:jc w:val="right"/>
-                  </w:pPr>
-                </w:p>
-              </w:tc>
-              <w:tc>
-                <w:tcPr>
-                  <w:tcW w:w="1108" w:type="dxa"/>
-                </w:tcPr>
-                <w:p>
-                  <w:pPr>
-                    <w:pStyle w:val="Compact"/>
-                    <w:spacing w:before="0" w:after="0" w:line="240" w:lineRule="auto"/>
-                    <w:jc w:val="right"/>
-                  </w:pPr>
-                </w:p>
-              </w:tc>
-              <w:tc>
-                <w:tcPr>
-                  <w:tcW w:w="1108" w:type="dxa"/>
-                </w:tcPr>
-                <w:p>
-                  <w:pPr>
-                    <w:pStyle w:val="Compact"/>
-                    <w:spacing w:before="0" w:after="0" w:line="240" w:lineRule="auto"/>
-                    <w:jc w:val="right"/>
-                  </w:pPr>
-                </w:p>
-              </w:tc>
-            </w:tr>
-            <w:tr>
-              <w:tc>
-                <w:tcPr>
-                  <w:tcW w:w="3483" w:type="dxa"/>
-                </w:tcPr>
-                <w:p>
-                  <w:pPr>
-                    <w:pStyle w:val="Compact"/>
-                    <w:spacing w:before="0" w:after="0" w:line="240" w:lineRule="auto"/>
-                    <w:jc w:val="left"/>
-                  </w:pPr>
-                  <w:r>
-                    <w:t xml:space="preserve">Care plan/pathway actions to follow up</w:t>
-                  </w:r>
-                </w:p>
-              </w:tc>
-              <w:tc>
-                <w:tcPr>
-                  <w:tcW w:w="1108" w:type="dxa"/>
-                </w:tcPr>
-                <w:p>
-                  <w:pPr>
-                    <w:pStyle w:val="Compact"/>
-                    <w:spacing w:before="0" w:after="0" w:line="240" w:lineRule="auto"/>
-                    <w:jc w:val="right"/>
-                  </w:pPr>
-                  <w:r>
-                    <w:t xml:space="preserve">0.90 (0.80-0.98)</w:t>
-                  </w:r>
-                </w:p>
-              </w:tc>
-              <w:tc>
-                <w:tcPr>
-                  <w:tcW w:w="1108" w:type="dxa"/>
-                </w:tcPr>
-                <w:p>
-                  <w:pPr>
-                    <w:pStyle w:val="Compact"/>
-                    <w:spacing w:before="0" w:after="0" w:line="240" w:lineRule="auto"/>
-                    <w:jc w:val="right"/>
-                  </w:pPr>
-                  <w:r>
-                    <w:t xml:space="preserve">0.90 (0.80-0.98)</w:t>
-                  </w:r>
-                </w:p>
-              </w:tc>
-              <w:tc>
-                <w:tcPr>
-                  <w:tcW w:w="1108" w:type="dxa"/>
-                </w:tcPr>
-                <w:p>
-                  <w:pPr>
-                    <w:pStyle w:val="Compact"/>
-                    <w:spacing w:before="0" w:after="0" w:line="240" w:lineRule="auto"/>
-                    <w:jc w:val="right"/>
-                  </w:pPr>
-                  <w:r>
-                    <w:t xml:space="preserve">1.00</w:t>
-                  </w:r>
-                </w:p>
-              </w:tc>
-              <w:tc>
-                <w:tcPr>
-                  <w:tcW w:w="1108" w:type="dxa"/>
-                </w:tcPr>
-                <w:p>
-                  <w:pPr>
-                    <w:pStyle w:val="Compact"/>
-                    <w:spacing w:before="0" w:after="0" w:line="240" w:lineRule="auto"/>
-                    <w:jc w:val="right"/>
-                  </w:pPr>
-                  <w:r>
-                    <w:t xml:space="preserve">0.95 (0.89-0.99)</w:t>
-                  </w:r>
-                </w:p>
-              </w:tc>
-            </w:tr>
-            <w:tr>
-              <w:tc>
-                <w:tcPr>
-                  <w:tcW w:w="3483" w:type="dxa"/>
-                </w:tcPr>
-                <w:p>
-                  <w:pPr>
-                    <w:pStyle w:val="Compact"/>
-                    <w:spacing w:before="0" w:after="0" w:line="240" w:lineRule="auto"/>
-                    <w:jc w:val="left"/>
-                  </w:pPr>
-                  <w:r>
-                    <w:t xml:space="preserve">Asked patient/carer about goals and preferences</w:t>
-                  </w:r>
-                </w:p>
-              </w:tc>
-              <w:tc>
-                <w:tcPr>
-                  <w:tcW w:w="1108" w:type="dxa"/>
-                </w:tcPr>
-                <w:p>
-                  <w:pPr>
-                    <w:pStyle w:val="Compact"/>
-                    <w:spacing w:before="0" w:after="0" w:line="240" w:lineRule="auto"/>
-                    <w:jc w:val="right"/>
-                  </w:pPr>
-                  <w:r>
-                    <w:t xml:space="preserve">0.80 (0.67-0.90)</w:t>
-                  </w:r>
-                </w:p>
-              </w:tc>
-              <w:tc>
-                <w:tcPr>
-                  <w:tcW w:w="1108" w:type="dxa"/>
-                </w:tcPr>
-                <w:p>
-                  <w:pPr>
-                    <w:pStyle w:val="Compact"/>
-                    <w:spacing w:before="0" w:after="0" w:line="240" w:lineRule="auto"/>
-                    <w:jc w:val="right"/>
-                  </w:pPr>
-                  <w:r>
-                    <w:t xml:space="preserve">0.00 (0.00-0.00)</w:t>
-                  </w:r>
-                </w:p>
-              </w:tc>
-              <w:tc>
-                <w:tcPr>
-                  <w:tcW w:w="1108" w:type="dxa"/>
-                </w:tcPr>
-                <w:p>
-                  <w:pPr>
-                    <w:pStyle w:val="Compact"/>
-                    <w:spacing w:before="0" w:after="0" w:line="240" w:lineRule="auto"/>
-                    <w:jc w:val="right"/>
-                  </w:pPr>
-                  <w:r>
-                    <w:t xml:space="preserve">0.00 (0.00-0.00)</w:t>
-                  </w:r>
-                </w:p>
-              </w:tc>
-              <w:tc>
-                <w:tcPr>
-                  <w:tcW w:w="1108" w:type="dxa"/>
-                </w:tcPr>
-                <w:p>
-                  <w:pPr>
-                    <w:pStyle w:val="Compact"/>
-                    <w:spacing w:before="0" w:after="0" w:line="240" w:lineRule="auto"/>
-                    <w:jc w:val="right"/>
-                  </w:pPr>
-                  <w:r>
-                    <w:t xml:space="preserve">0.00 (0.00-0.00)</w:t>
-                  </w:r>
-                </w:p>
-              </w:tc>
-            </w:tr>
-            <w:tr>
-              <w:tc>
-                <w:tcPr>
-                  <w:tcW w:w="3483" w:type="dxa"/>
-                </w:tcPr>
-                <w:p>
-                  <w:pPr>
-                    <w:pStyle w:val="Compact"/>
-                    <w:spacing w:before="0" w:after="0" w:line="240" w:lineRule="auto"/>
-                    <w:jc w:val="left"/>
-                  </w:pPr>
-                  <w:r>
-                    <w:t xml:space="preserve">Discharge plan</w:t>
-                  </w:r>
-                </w:p>
-              </w:tc>
-              <w:tc>
-                <w:tcPr>
-                  <w:tcW w:w="1108" w:type="dxa"/>
-                </w:tcPr>
-                <w:p>
-                  <w:pPr>
-                    <w:pStyle w:val="Compact"/>
-                    <w:spacing w:before="0" w:after="0" w:line="240" w:lineRule="auto"/>
-                    <w:jc w:val="right"/>
-                  </w:pPr>
-                  <w:r>
-                    <w:t xml:space="preserve">0.98 (0.94-1.00)</w:t>
-                  </w:r>
-                </w:p>
-              </w:tc>
-              <w:tc>
-                <w:tcPr>
-                  <w:tcW w:w="1108" w:type="dxa"/>
-                </w:tcPr>
-                <w:p>
-                  <w:pPr>
-                    <w:pStyle w:val="Compact"/>
-                    <w:spacing w:before="0" w:after="0" w:line="240" w:lineRule="auto"/>
-                    <w:jc w:val="right"/>
-                  </w:pPr>
-                  <w:r>
-                    <w:t xml:space="preserve">0.80 (0.33-1.00)</w:t>
-                  </w:r>
-                </w:p>
-              </w:tc>
-              <w:tc>
-                <w:tcPr>
-                  <w:tcW w:w="1108" w:type="dxa"/>
-                </w:tcPr>
-                <w:p>
-                  <w:pPr>
-                    <w:pStyle w:val="Compact"/>
-                    <w:spacing w:before="0" w:after="0" w:line="240" w:lineRule="auto"/>
-                    <w:jc w:val="right"/>
-                  </w:pPr>
-                  <w:r>
-                    <w:t xml:space="preserve">1.00</w:t>
-                  </w:r>
-                </w:p>
-              </w:tc>
-              <w:tc>
-                <w:tcPr>
-                  <w:tcW w:w="1108" w:type="dxa"/>
-                </w:tcPr>
-                <w:p>
-                  <w:pPr>
-                    <w:pStyle w:val="Compact"/>
-                    <w:spacing w:before="0" w:after="0" w:line="240" w:lineRule="auto"/>
-                    <w:jc w:val="right"/>
-                  </w:pPr>
-                  <w:r>
-                    <w:t xml:space="preserve">0.89 (0.50-1.00)</w:t>
-                  </w:r>
-                </w:p>
-              </w:tc>
-            </w:tr>
-            <w:tr>
-              <w:tc>
-                <w:tcPr>
-                  <w:tcW w:w="3483" w:type="dxa"/>
-                </w:tcPr>
-                <w:p>
-                  <w:pPr>
-                    <w:pStyle w:val="Compact"/>
-                    <w:spacing w:before="0" w:after="0" w:line="240" w:lineRule="auto"/>
-                    <w:jc w:val="left"/>
-                  </w:pPr>
-                  <w:r>
-                    <w:t xml:space="preserve">Critical actions required</w:t>
-                  </w:r>
-                </w:p>
-              </w:tc>
-              <w:tc>
-                <w:tcPr>
-                  <w:tcW w:w="1108" w:type="dxa"/>
-                </w:tcPr>
-                <w:p>
-                  <w:pPr>
-                    <w:pStyle w:val="Compact"/>
-                    <w:spacing w:before="0" w:after="0" w:line="240" w:lineRule="auto"/>
-                    <w:jc w:val="right"/>
-                  </w:pPr>
-                  <w:r>
-                    <w:t xml:space="preserve">0.92 (0.84-0.98)</w:t>
-                  </w:r>
-                </w:p>
-              </w:tc>
-              <w:tc>
-                <w:tcPr>
-                  <w:tcW w:w="1108" w:type="dxa"/>
-                </w:tcPr>
-                <w:p>
-                  <w:pPr>
-                    <w:pStyle w:val="Compact"/>
-                    <w:spacing w:before="0" w:after="0" w:line="240" w:lineRule="auto"/>
-                    <w:jc w:val="right"/>
-                  </w:pPr>
-                  <w:r>
-                    <w:t xml:space="preserve">0.20 (0.00-0.67)</w:t>
-                  </w:r>
-                </w:p>
-              </w:tc>
-              <w:tc>
-                <w:tcPr>
-                  <w:tcW w:w="1108" w:type="dxa"/>
-                </w:tcPr>
-                <w:p>
-                  <w:pPr>
-                    <w:pStyle w:val="Compact"/>
-                    <w:spacing w:before="0" w:after="0" w:line="240" w:lineRule="auto"/>
-                    <w:jc w:val="right"/>
-                  </w:pPr>
-                  <w:r>
-                    <w:t xml:space="preserve">1.00</w:t>
-                  </w:r>
-                </w:p>
-              </w:tc>
-              <w:tc>
-                <w:tcPr>
-                  <w:tcW w:w="1108" w:type="dxa"/>
-                </w:tcPr>
-                <w:p>
-                  <w:pPr>
-                    <w:pStyle w:val="Compact"/>
-                    <w:spacing w:before="0" w:after="0" w:line="240" w:lineRule="auto"/>
-                    <w:jc w:val="right"/>
-                  </w:pPr>
-                  <w:r>
-                    <w:t xml:space="preserve">0.33 (0.00-0.80)</w:t>
-                  </w:r>
-                </w:p>
-              </w:tc>
-            </w:tr>
-            <w:tr>
-              <w:tc>
-                <w:tcPr>
-                  <w:tcW w:w="3483" w:type="dxa"/>
-                </w:tcPr>
-                <w:p>
-                  <w:pPr>
-                    <w:pStyle w:val="Compact"/>
-                    <w:spacing w:before="0" w:after="0" w:line="240" w:lineRule="auto"/>
-                    <w:jc w:val="left"/>
-                  </w:pPr>
-                  <w:r>
-                    <w:rPr>
-                      <w:b/>
-                      <w:bCs/>
-                    </w:rPr>
-                    <w:t xml:space="preserve">Patient Involvement</w:t>
-                  </w:r>
-                </w:p>
-              </w:tc>
-              <w:tc>
-                <w:tcPr>
-                  <w:tcW w:w="1108" w:type="dxa"/>
-                </w:tcPr>
-                <w:p>
-                  <w:pPr>
-                    <w:pStyle w:val="Compact"/>
-                    <w:spacing w:before="0" w:after="0" w:line="240" w:lineRule="auto"/>
-                    <w:jc w:val="right"/>
-                  </w:pPr>
-                </w:p>
-              </w:tc>
-              <w:tc>
-                <w:tcPr>
-                  <w:tcW w:w="1108" w:type="dxa"/>
-                </w:tcPr>
-                <w:p>
-                  <w:pPr>
-                    <w:pStyle w:val="Compact"/>
-                    <w:spacing w:before="0" w:after="0" w:line="240" w:lineRule="auto"/>
-                    <w:jc w:val="right"/>
-                  </w:pPr>
-                </w:p>
-              </w:tc>
-              <w:tc>
-                <w:tcPr>
-                  <w:tcW w:w="1108" w:type="dxa"/>
-                </w:tcPr>
-                <w:p>
-                  <w:pPr>
-                    <w:pStyle w:val="Compact"/>
-                    <w:spacing w:before="0" w:after="0" w:line="240" w:lineRule="auto"/>
-                    <w:jc w:val="right"/>
-                  </w:pPr>
-                </w:p>
-              </w:tc>
-              <w:tc>
-                <w:tcPr>
-                  <w:tcW w:w="1108" w:type="dxa"/>
-                </w:tcPr>
-                <w:p>
-                  <w:pPr>
-                    <w:pStyle w:val="Compact"/>
-                    <w:spacing w:before="0" w:after="0" w:line="240" w:lineRule="auto"/>
-                    <w:jc w:val="right"/>
-                  </w:pPr>
-                </w:p>
-              </w:tc>
-            </w:tr>
-            <w:tr>
-              <w:tc>
-                <w:tcPr>
-                  <w:tcW w:w="3483" w:type="dxa"/>
-                </w:tcPr>
-                <w:p>
-                  <w:pPr>
-                    <w:pStyle w:val="Compact"/>
-                    <w:spacing w:before="0" w:after="0" w:line="240" w:lineRule="auto"/>
-                    <w:jc w:val="left"/>
-                  </w:pPr>
-                  <w:r>
-                    <w:t xml:space="preserve">Introduction of clinicians involved in handover to patient/carer</w:t>
-                  </w:r>
-                </w:p>
-              </w:tc>
-              <w:tc>
-                <w:tcPr>
-                  <w:tcW w:w="1108" w:type="dxa"/>
-                </w:tcPr>
-                <w:p>
-                  <w:pPr>
-                    <w:pStyle w:val="Compact"/>
-                    <w:spacing w:before="0" w:after="0" w:line="240" w:lineRule="auto"/>
-                    <w:jc w:val="right"/>
-                  </w:pPr>
-                  <w:r>
-                    <w:t xml:space="preserve">0.84 (0.73-0.94)</w:t>
-                  </w:r>
-                </w:p>
-              </w:tc>
-              <w:tc>
-                <w:tcPr>
-                  <w:tcW w:w="1108" w:type="dxa"/>
-                </w:tcPr>
-                <w:p>
-                  <w:pPr>
-                    <w:pStyle w:val="Compact"/>
-                    <w:spacing w:before="0" w:after="0" w:line="240" w:lineRule="auto"/>
-                    <w:jc w:val="right"/>
-                  </w:pPr>
-                  <w:r>
-                    <w:t xml:space="preserve">0.71 (0.55-0.87)</w:t>
-                  </w:r>
-                </w:p>
-              </w:tc>
-              <w:tc>
-                <w:tcPr>
-                  <w:tcW w:w="1108" w:type="dxa"/>
-                </w:tcPr>
-                <w:p>
-                  <w:pPr>
-                    <w:pStyle w:val="Compact"/>
-                    <w:spacing w:before="0" w:after="0" w:line="240" w:lineRule="auto"/>
-                    <w:jc w:val="right"/>
-                  </w:pPr>
-                  <w:r>
-                    <w:t xml:space="preserve">1.00</w:t>
-                  </w:r>
-                </w:p>
-              </w:tc>
-              <w:tc>
-                <w:tcPr>
-                  <w:tcW w:w="1108" w:type="dxa"/>
-                </w:tcPr>
-                <w:p>
-                  <w:pPr>
-                    <w:pStyle w:val="Compact"/>
-                    <w:spacing w:before="0" w:after="0" w:line="240" w:lineRule="auto"/>
-                    <w:jc w:val="right"/>
-                  </w:pPr>
-                  <w:r>
-                    <w:t xml:space="preserve">0.83 (0.71-0.93)</w:t>
-                  </w:r>
-                </w:p>
-              </w:tc>
-            </w:tr>
-            <w:tr>
-              <w:tc>
-                <w:tcPr>
-                  <w:tcW w:w="3483" w:type="dxa"/>
-                </w:tcPr>
-                <w:p>
-                  <w:pPr>
-                    <w:pStyle w:val="Compact"/>
-                    <w:spacing w:before="0" w:after="0" w:line="240" w:lineRule="auto"/>
-                    <w:jc w:val="left"/>
-                  </w:pPr>
-                  <w:r>
-                    <w:t xml:space="preserve">Invitation for patient/carer to participate in handover</w:t>
-                  </w:r>
-                </w:p>
-              </w:tc>
-              <w:tc>
-                <w:tcPr>
-                  <w:tcW w:w="1108" w:type="dxa"/>
-                </w:tcPr>
-                <w:p>
-                  <w:pPr>
-                    <w:pStyle w:val="Compact"/>
-                    <w:spacing w:before="0" w:after="0" w:line="240" w:lineRule="auto"/>
-                    <w:jc w:val="right"/>
-                  </w:pPr>
-                  <w:r>
-                    <w:t xml:space="preserve">0.82 (0.69-0.92)</w:t>
-                  </w:r>
-                </w:p>
-              </w:tc>
-              <w:tc>
-                <w:tcPr>
-                  <w:tcW w:w="1108" w:type="dxa"/>
-                </w:tcPr>
-                <w:p>
-                  <w:pPr>
-                    <w:pStyle w:val="Compact"/>
-                    <w:spacing w:before="0" w:after="0" w:line="240" w:lineRule="auto"/>
-                    <w:jc w:val="right"/>
-                  </w:pPr>
-                  <w:r>
-                    <w:t xml:space="preserve">0.65 (0.44-0.83)</w:t>
-                  </w:r>
-                </w:p>
-              </w:tc>
-              <w:tc>
-                <w:tcPr>
-                  <w:tcW w:w="1108" w:type="dxa"/>
-                </w:tcPr>
-                <w:p>
-                  <w:pPr>
-                    <w:pStyle w:val="Compact"/>
-                    <w:spacing w:before="0" w:after="0" w:line="240" w:lineRule="auto"/>
-                    <w:jc w:val="right"/>
-                  </w:pPr>
-                  <w:r>
-                    <w:t xml:space="preserve">0.94 (0.78-1.00)</w:t>
-                  </w:r>
-                </w:p>
-              </w:tc>
-              <w:tc>
-                <w:tcPr>
-                  <w:tcW w:w="1108" w:type="dxa"/>
-                </w:tcPr>
-                <w:p>
-                  <w:pPr>
-                    <w:pStyle w:val="Compact"/>
-                    <w:spacing w:before="0" w:after="0" w:line="240" w:lineRule="auto"/>
-                    <w:jc w:val="right"/>
-                  </w:pPr>
-                  <w:r>
-                    <w:t xml:space="preserve">0.77 (0.59-0.89)</w:t>
-                  </w:r>
-                </w:p>
-              </w:tc>
-            </w:tr>
           </w:tbl>
-          <w:bookmarkEnd w:id="132"/>
+          <w:bookmarkEnd w:id="156"/>
           <w:p/>
+        </w:tc>
+      </w:tr>
+    </w:tbl>
+    <w:p>
+      <w:r>
+        <w:br w:type="page"/>
+      </w:r>
+    </w:p>
+    <w:p>
+      <w:pPr>
+        <w:pStyle w:val="BodyText"/>
+      </w:pPr>
+      <w:r>
+        <w:rPr>
+          <w:i/>
+          <w:iCs/>
+        </w:rPr>
+        <w:t xml:space="preserve">Table 5 (continued)</w:t>
+      </w:r>
+    </w:p>
+    <w:tbl>
+      <w:tblPr>
+        <w:tblStyle w:val="Table"/>
+        <w:tblW w:type="pct" w:w="5000"/>
+        <w:tblLayout w:type="fixed"/>
+        <w:tblLook w:firstRow="1" w:lastRow="0" w:firstColumn="0" w:lastColumn="0" w:noHBand="0" w:noVBand="0" w:val="0020"/>
+      </w:tblPr>
+      <w:tblGrid>
+        <w:gridCol w:w="3483"/>
+        <w:gridCol w:w="1108"/>
+        <w:gridCol w:w="1108"/>
+        <w:gridCol w:w="1108"/>
+        <w:gridCol w:w="1108"/>
+      </w:tblGrid>
+      <w:tr>
+        <w:trPr>
+          <w:tblHeader w:val="on"/>
+        </w:trPr>
+        <w:tc>
+          <w:tcPr>
+            <w:tcW w:w="3483" w:type="dxa"/>
+          </w:tcPr>
+          <w:p>
+            <w:pPr>
+              <w:pStyle w:val="Compact"/>
+              <w:spacing w:before="0" w:after="0" w:line="240" w:lineRule="auto"/>
+              <w:jc w:val="left"/>
+            </w:pPr>
+            <w:r>
+              <w:t xml:space="preserve">Checklist item</w:t>
+            </w:r>
+          </w:p>
+        </w:tc>
+        <w:tc>
+          <w:tcPr>
+            <w:tcW w:w="1108" w:type="dxa"/>
+          </w:tcPr>
+          <w:p>
+            <w:pPr>
+              <w:pStyle w:val="Compact"/>
+              <w:spacing w:before="0" w:after="0" w:line="240" w:lineRule="auto"/>
+              <w:jc w:val="right"/>
+            </w:pPr>
+            <w:r>
+              <w:t xml:space="preserve">Accuracy</w:t>
+            </w:r>
+          </w:p>
+        </w:tc>
+        <w:tc>
+          <w:tcPr>
+            <w:tcW w:w="1108" w:type="dxa"/>
+          </w:tcPr>
+          <w:p>
+            <w:pPr>
+              <w:pStyle w:val="Compact"/>
+              <w:spacing w:before="0" w:after="0" w:line="240" w:lineRule="auto"/>
+              <w:jc w:val="right"/>
+            </w:pPr>
+            <w:r>
+              <w:t xml:space="preserve">Precision</w:t>
+            </w:r>
+          </w:p>
+        </w:tc>
+        <w:tc>
+          <w:tcPr>
+            <w:tcW w:w="1108" w:type="dxa"/>
+          </w:tcPr>
+          <w:p>
+            <w:pPr>
+              <w:pStyle w:val="Compact"/>
+              <w:spacing w:before="0" w:after="0" w:line="240" w:lineRule="auto"/>
+              <w:jc w:val="right"/>
+            </w:pPr>
+            <w:r>
+              <w:t xml:space="preserve">Recall</w:t>
+            </w:r>
+          </w:p>
+        </w:tc>
+        <w:tc>
+          <w:tcPr>
+            <w:tcW w:w="1108" w:type="dxa"/>
+          </w:tcPr>
+          <w:p>
+            <w:pPr>
+              <w:pStyle w:val="Compact"/>
+              <w:spacing w:before="0" w:after="0" w:line="240" w:lineRule="auto"/>
+              <w:jc w:val="right"/>
+            </w:pPr>
+            <w:r>
+              <w:t xml:space="preserve">F1</w:t>
+            </w:r>
+          </w:p>
+        </w:tc>
+      </w:tr>
+      <w:tr>
+        <w:tc>
+          <w:tcPr>
+            <w:tcW w:w="3483" w:type="dxa"/>
+          </w:tcPr>
+          <w:p>
+            <w:pPr>
+              <w:pStyle w:val="Compact"/>
+              <w:spacing w:before="0" w:after="0" w:line="240" w:lineRule="auto"/>
+              <w:jc w:val="left"/>
+            </w:pPr>
+            <w:r>
+              <w:rPr>
+                <w:b/>
+                <w:bCs/>
+              </w:rPr>
+              <w:t xml:space="preserve">Recommendation</w:t>
+            </w:r>
+          </w:p>
+        </w:tc>
+        <w:tc>
+          <w:tcPr>
+            <w:tcW w:w="1108" w:type="dxa"/>
+          </w:tcPr>
+          <w:p>
+            <w:pPr>
+              <w:pStyle w:val="Compact"/>
+              <w:spacing w:before="0" w:after="0" w:line="240" w:lineRule="auto"/>
+              <w:jc w:val="right"/>
+            </w:pPr>
+          </w:p>
+        </w:tc>
+        <w:tc>
+          <w:tcPr>
+            <w:tcW w:w="1108" w:type="dxa"/>
+          </w:tcPr>
+          <w:p>
+            <w:pPr>
+              <w:pStyle w:val="Compact"/>
+              <w:spacing w:before="0" w:after="0" w:line="240" w:lineRule="auto"/>
+              <w:jc w:val="right"/>
+            </w:pPr>
+          </w:p>
+        </w:tc>
+        <w:tc>
+          <w:tcPr>
+            <w:tcW w:w="1108" w:type="dxa"/>
+          </w:tcPr>
+          <w:p>
+            <w:pPr>
+              <w:pStyle w:val="Compact"/>
+              <w:spacing w:before="0" w:after="0" w:line="240" w:lineRule="auto"/>
+              <w:jc w:val="right"/>
+            </w:pPr>
+          </w:p>
+        </w:tc>
+        <w:tc>
+          <w:tcPr>
+            <w:tcW w:w="1108" w:type="dxa"/>
+          </w:tcPr>
+          <w:p>
+            <w:pPr>
+              <w:pStyle w:val="Compact"/>
+              <w:spacing w:before="0" w:after="0" w:line="240" w:lineRule="auto"/>
+              <w:jc w:val="right"/>
+            </w:pPr>
+          </w:p>
+        </w:tc>
+      </w:tr>
+      <w:tr>
+        <w:tc>
+          <w:tcPr>
+            <w:tcW w:w="3483" w:type="dxa"/>
+          </w:tcPr>
+          <w:p>
+            <w:pPr>
+              <w:pStyle w:val="Compact"/>
+              <w:spacing w:before="0" w:after="0" w:line="240" w:lineRule="auto"/>
+              <w:jc w:val="left"/>
+            </w:pPr>
+            <w:r>
+              <w:t xml:space="preserve">Care plan/pathway actions to follow up</w:t>
+            </w:r>
+          </w:p>
+        </w:tc>
+        <w:tc>
+          <w:tcPr>
+            <w:tcW w:w="1108" w:type="dxa"/>
+          </w:tcPr>
+          <w:p>
+            <w:pPr>
+              <w:pStyle w:val="Compact"/>
+              <w:spacing w:before="0" w:after="0" w:line="240" w:lineRule="auto"/>
+              <w:jc w:val="right"/>
+            </w:pPr>
+            <w:r>
+              <w:t xml:space="preserve">0.90 (0.80-0.98)</w:t>
+            </w:r>
+          </w:p>
+        </w:tc>
+        <w:tc>
+          <w:tcPr>
+            <w:tcW w:w="1108" w:type="dxa"/>
+          </w:tcPr>
+          <w:p>
+            <w:pPr>
+              <w:pStyle w:val="Compact"/>
+              <w:spacing w:before="0" w:after="0" w:line="240" w:lineRule="auto"/>
+              <w:jc w:val="right"/>
+            </w:pPr>
+            <w:r>
+              <w:t xml:space="preserve">0.90 (0.80-0.98)</w:t>
+            </w:r>
+          </w:p>
+        </w:tc>
+        <w:tc>
+          <w:tcPr>
+            <w:tcW w:w="1108" w:type="dxa"/>
+          </w:tcPr>
+          <w:p>
+            <w:pPr>
+              <w:pStyle w:val="Compact"/>
+              <w:spacing w:before="0" w:after="0" w:line="240" w:lineRule="auto"/>
+              <w:jc w:val="right"/>
+            </w:pPr>
+            <w:r>
+              <w:t xml:space="preserve">1.00</w:t>
+            </w:r>
+          </w:p>
+        </w:tc>
+        <w:tc>
+          <w:tcPr>
+            <w:tcW w:w="1108" w:type="dxa"/>
+          </w:tcPr>
+          <w:p>
+            <w:pPr>
+              <w:pStyle w:val="Compact"/>
+              <w:spacing w:before="0" w:after="0" w:line="240" w:lineRule="auto"/>
+              <w:jc w:val="right"/>
+            </w:pPr>
+            <w:r>
+              <w:t xml:space="preserve">0.95 (0.89-0.99)</w:t>
+            </w:r>
+          </w:p>
+        </w:tc>
+      </w:tr>
+      <w:tr>
+        <w:tc>
+          <w:tcPr>
+            <w:tcW w:w="3483" w:type="dxa"/>
+          </w:tcPr>
+          <w:p>
+            <w:pPr>
+              <w:pStyle w:val="Compact"/>
+              <w:spacing w:before="0" w:after="0" w:line="240" w:lineRule="auto"/>
+              <w:jc w:val="left"/>
+            </w:pPr>
+            <w:r>
+              <w:t xml:space="preserve">Asked patient/carer about goals and preferences</w:t>
+            </w:r>
+          </w:p>
+        </w:tc>
+        <w:tc>
+          <w:tcPr>
+            <w:tcW w:w="1108" w:type="dxa"/>
+          </w:tcPr>
+          <w:p>
+            <w:pPr>
+              <w:pStyle w:val="Compact"/>
+              <w:spacing w:before="0" w:after="0" w:line="240" w:lineRule="auto"/>
+              <w:jc w:val="right"/>
+            </w:pPr>
+            <w:r>
+              <w:t xml:space="preserve">0.80 (0.67-0.90)</w:t>
+            </w:r>
+          </w:p>
+        </w:tc>
+        <w:tc>
+          <w:tcPr>
+            <w:tcW w:w="1108" w:type="dxa"/>
+          </w:tcPr>
+          <w:p>
+            <w:pPr>
+              <w:pStyle w:val="Compact"/>
+              <w:spacing w:before="0" w:after="0" w:line="240" w:lineRule="auto"/>
+              <w:jc w:val="right"/>
+            </w:pPr>
+            <w:r>
+              <w:t xml:space="preserve">0.00 (0.00-0.00)</w:t>
+            </w:r>
+          </w:p>
+        </w:tc>
+        <w:tc>
+          <w:tcPr>
+            <w:tcW w:w="1108" w:type="dxa"/>
+          </w:tcPr>
+          <w:p>
+            <w:pPr>
+              <w:pStyle w:val="Compact"/>
+              <w:spacing w:before="0" w:after="0" w:line="240" w:lineRule="auto"/>
+              <w:jc w:val="right"/>
+            </w:pPr>
+            <w:r>
+              <w:t xml:space="preserve">0.00 (0.00-0.00)</w:t>
+            </w:r>
+          </w:p>
+        </w:tc>
+        <w:tc>
+          <w:tcPr>
+            <w:tcW w:w="1108" w:type="dxa"/>
+          </w:tcPr>
+          <w:p>
+            <w:pPr>
+              <w:pStyle w:val="Compact"/>
+              <w:spacing w:before="0" w:after="0" w:line="240" w:lineRule="auto"/>
+              <w:jc w:val="right"/>
+            </w:pPr>
+            <w:r>
+              <w:t xml:space="preserve">0.00 (0.00-0.00)</w:t>
+            </w:r>
+          </w:p>
+        </w:tc>
+      </w:tr>
+      <w:tr>
+        <w:tc>
+          <w:tcPr>
+            <w:tcW w:w="3483" w:type="dxa"/>
+          </w:tcPr>
+          <w:p>
+            <w:pPr>
+              <w:pStyle w:val="Compact"/>
+              <w:spacing w:before="0" w:after="0" w:line="240" w:lineRule="auto"/>
+              <w:jc w:val="left"/>
+            </w:pPr>
+            <w:r>
+              <w:t xml:space="preserve">Discharge plan</w:t>
+            </w:r>
+          </w:p>
+        </w:tc>
+        <w:tc>
+          <w:tcPr>
+            <w:tcW w:w="1108" w:type="dxa"/>
+          </w:tcPr>
+          <w:p>
+            <w:pPr>
+              <w:pStyle w:val="Compact"/>
+              <w:spacing w:before="0" w:after="0" w:line="240" w:lineRule="auto"/>
+              <w:jc w:val="right"/>
+            </w:pPr>
+            <w:r>
+              <w:t xml:space="preserve">0.98 (0.94-1.00)</w:t>
+            </w:r>
+          </w:p>
+        </w:tc>
+        <w:tc>
+          <w:tcPr>
+            <w:tcW w:w="1108" w:type="dxa"/>
+          </w:tcPr>
+          <w:p>
+            <w:pPr>
+              <w:pStyle w:val="Compact"/>
+              <w:spacing w:before="0" w:after="0" w:line="240" w:lineRule="auto"/>
+              <w:jc w:val="right"/>
+            </w:pPr>
+            <w:r>
+              <w:t xml:space="preserve">0.80 (0.33-1.00)</w:t>
+            </w:r>
+          </w:p>
+        </w:tc>
+        <w:tc>
+          <w:tcPr>
+            <w:tcW w:w="1108" w:type="dxa"/>
+          </w:tcPr>
+          <w:p>
+            <w:pPr>
+              <w:pStyle w:val="Compact"/>
+              <w:spacing w:before="0" w:after="0" w:line="240" w:lineRule="auto"/>
+              <w:jc w:val="right"/>
+            </w:pPr>
+            <w:r>
+              <w:t xml:space="preserve">1.00</w:t>
+            </w:r>
+          </w:p>
+        </w:tc>
+        <w:tc>
+          <w:tcPr>
+            <w:tcW w:w="1108" w:type="dxa"/>
+          </w:tcPr>
+          <w:p>
+            <w:pPr>
+              <w:pStyle w:val="Compact"/>
+              <w:spacing w:before="0" w:after="0" w:line="240" w:lineRule="auto"/>
+              <w:jc w:val="right"/>
+            </w:pPr>
+            <w:r>
+              <w:t xml:space="preserve">0.89 (0.50-1.00)</w:t>
+            </w:r>
+          </w:p>
+        </w:tc>
+      </w:tr>
+      <w:tr>
+        <w:tc>
+          <w:tcPr>
+            <w:tcW w:w="3483" w:type="dxa"/>
+          </w:tcPr>
+          <w:p>
+            <w:pPr>
+              <w:pStyle w:val="Compact"/>
+              <w:spacing w:before="0" w:after="0" w:line="240" w:lineRule="auto"/>
+              <w:jc w:val="left"/>
+            </w:pPr>
+            <w:r>
+              <w:t xml:space="preserve">Critical actions required</w:t>
+            </w:r>
+          </w:p>
+        </w:tc>
+        <w:tc>
+          <w:tcPr>
+            <w:tcW w:w="1108" w:type="dxa"/>
+          </w:tcPr>
+          <w:p>
+            <w:pPr>
+              <w:pStyle w:val="Compact"/>
+              <w:spacing w:before="0" w:after="0" w:line="240" w:lineRule="auto"/>
+              <w:jc w:val="right"/>
+            </w:pPr>
+            <w:r>
+              <w:t xml:space="preserve">0.92 (0.84-0.98)</w:t>
+            </w:r>
+          </w:p>
+        </w:tc>
+        <w:tc>
+          <w:tcPr>
+            <w:tcW w:w="1108" w:type="dxa"/>
+          </w:tcPr>
+          <w:p>
+            <w:pPr>
+              <w:pStyle w:val="Compact"/>
+              <w:spacing w:before="0" w:after="0" w:line="240" w:lineRule="auto"/>
+              <w:jc w:val="right"/>
+            </w:pPr>
+            <w:r>
+              <w:t xml:space="preserve">0.20 (0.00-0.67)</w:t>
+            </w:r>
+          </w:p>
+        </w:tc>
+        <w:tc>
+          <w:tcPr>
+            <w:tcW w:w="1108" w:type="dxa"/>
+          </w:tcPr>
+          <w:p>
+            <w:pPr>
+              <w:pStyle w:val="Compact"/>
+              <w:spacing w:before="0" w:after="0" w:line="240" w:lineRule="auto"/>
+              <w:jc w:val="right"/>
+            </w:pPr>
+            <w:r>
+              <w:t xml:space="preserve">1.00</w:t>
+            </w:r>
+          </w:p>
+        </w:tc>
+        <w:tc>
+          <w:tcPr>
+            <w:tcW w:w="1108" w:type="dxa"/>
+          </w:tcPr>
+          <w:p>
+            <w:pPr>
+              <w:pStyle w:val="Compact"/>
+              <w:spacing w:before="0" w:after="0" w:line="240" w:lineRule="auto"/>
+              <w:jc w:val="right"/>
+            </w:pPr>
+            <w:r>
+              <w:t xml:space="preserve">0.33 (0.00-0.80)</w:t>
+            </w:r>
+          </w:p>
+        </w:tc>
+      </w:tr>
+      <w:tr>
+        <w:tc>
+          <w:tcPr>
+            <w:tcW w:w="3483" w:type="dxa"/>
+          </w:tcPr>
+          <w:p>
+            <w:pPr>
+              <w:pStyle w:val="Compact"/>
+              <w:spacing w:before="0" w:after="0" w:line="240" w:lineRule="auto"/>
+              <w:jc w:val="left"/>
+            </w:pPr>
+            <w:r>
+              <w:rPr>
+                <w:b/>
+                <w:bCs/>
+              </w:rPr>
+              <w:t xml:space="preserve">Patient Involvement</w:t>
+            </w:r>
+          </w:p>
+        </w:tc>
+        <w:tc>
+          <w:tcPr>
+            <w:tcW w:w="1108" w:type="dxa"/>
+          </w:tcPr>
+          <w:p>
+            <w:pPr>
+              <w:pStyle w:val="Compact"/>
+              <w:spacing w:before="0" w:after="0" w:line="240" w:lineRule="auto"/>
+              <w:jc w:val="right"/>
+            </w:pPr>
+          </w:p>
+        </w:tc>
+        <w:tc>
+          <w:tcPr>
+            <w:tcW w:w="1108" w:type="dxa"/>
+          </w:tcPr>
+          <w:p>
+            <w:pPr>
+              <w:pStyle w:val="Compact"/>
+              <w:spacing w:before="0" w:after="0" w:line="240" w:lineRule="auto"/>
+              <w:jc w:val="right"/>
+            </w:pPr>
+          </w:p>
+        </w:tc>
+        <w:tc>
+          <w:tcPr>
+            <w:tcW w:w="1108" w:type="dxa"/>
+          </w:tcPr>
+          <w:p>
+            <w:pPr>
+              <w:pStyle w:val="Compact"/>
+              <w:spacing w:before="0" w:after="0" w:line="240" w:lineRule="auto"/>
+              <w:jc w:val="right"/>
+            </w:pPr>
+          </w:p>
+        </w:tc>
+        <w:tc>
+          <w:tcPr>
+            <w:tcW w:w="1108" w:type="dxa"/>
+          </w:tcPr>
+          <w:p>
+            <w:pPr>
+              <w:pStyle w:val="Compact"/>
+              <w:spacing w:before="0" w:after="0" w:line="240" w:lineRule="auto"/>
+              <w:jc w:val="right"/>
+            </w:pPr>
+          </w:p>
+        </w:tc>
+      </w:tr>
+      <w:tr>
+        <w:tc>
+          <w:tcPr>
+            <w:tcW w:w="3483" w:type="dxa"/>
+          </w:tcPr>
+          <w:p>
+            <w:pPr>
+              <w:pStyle w:val="Compact"/>
+              <w:spacing w:before="0" w:after="0" w:line="240" w:lineRule="auto"/>
+              <w:jc w:val="left"/>
+            </w:pPr>
+            <w:r>
+              <w:t xml:space="preserve">Introduction of clinicians involved in handover to patient/carer</w:t>
+            </w:r>
+          </w:p>
+        </w:tc>
+        <w:tc>
+          <w:tcPr>
+            <w:tcW w:w="1108" w:type="dxa"/>
+          </w:tcPr>
+          <w:p>
+            <w:pPr>
+              <w:pStyle w:val="Compact"/>
+              <w:spacing w:before="0" w:after="0" w:line="240" w:lineRule="auto"/>
+              <w:jc w:val="right"/>
+            </w:pPr>
+            <w:r>
+              <w:t xml:space="preserve">0.84 (0.73-0.94)</w:t>
+            </w:r>
+          </w:p>
+        </w:tc>
+        <w:tc>
+          <w:tcPr>
+            <w:tcW w:w="1108" w:type="dxa"/>
+          </w:tcPr>
+          <w:p>
+            <w:pPr>
+              <w:pStyle w:val="Compact"/>
+              <w:spacing w:before="0" w:after="0" w:line="240" w:lineRule="auto"/>
+              <w:jc w:val="right"/>
+            </w:pPr>
+            <w:r>
+              <w:t xml:space="preserve">0.71 (0.55-0.87)</w:t>
+            </w:r>
+          </w:p>
+        </w:tc>
+        <w:tc>
+          <w:tcPr>
+            <w:tcW w:w="1108" w:type="dxa"/>
+          </w:tcPr>
+          <w:p>
+            <w:pPr>
+              <w:pStyle w:val="Compact"/>
+              <w:spacing w:before="0" w:after="0" w:line="240" w:lineRule="auto"/>
+              <w:jc w:val="right"/>
+            </w:pPr>
+            <w:r>
+              <w:t xml:space="preserve">1.00</w:t>
+            </w:r>
+          </w:p>
+        </w:tc>
+        <w:tc>
+          <w:tcPr>
+            <w:tcW w:w="1108" w:type="dxa"/>
+          </w:tcPr>
+          <w:p>
+            <w:pPr>
+              <w:pStyle w:val="Compact"/>
+              <w:spacing w:before="0" w:after="0" w:line="240" w:lineRule="auto"/>
+              <w:jc w:val="right"/>
+            </w:pPr>
+            <w:r>
+              <w:t xml:space="preserve">0.83 (0.71-0.93)</w:t>
+            </w:r>
+          </w:p>
+        </w:tc>
+      </w:tr>
+      <w:tr>
+        <w:tc>
+          <w:tcPr>
+            <w:tcW w:w="3483" w:type="dxa"/>
+          </w:tcPr>
+          <w:p>
+            <w:pPr>
+              <w:pStyle w:val="Compact"/>
+              <w:spacing w:before="0" w:after="0" w:line="240" w:lineRule="auto"/>
+              <w:jc w:val="left"/>
+            </w:pPr>
+            <w:r>
+              <w:t xml:space="preserve">Invitation for patient/carer to participate in handover</w:t>
+            </w:r>
+          </w:p>
+        </w:tc>
+        <w:tc>
+          <w:tcPr>
+            <w:tcW w:w="1108" w:type="dxa"/>
+          </w:tcPr>
+          <w:p>
+            <w:pPr>
+              <w:pStyle w:val="Compact"/>
+              <w:spacing w:before="0" w:after="0" w:line="240" w:lineRule="auto"/>
+              <w:jc w:val="right"/>
+            </w:pPr>
+            <w:r>
+              <w:t xml:space="preserve">0.82 (0.69-0.92)</w:t>
+            </w:r>
+          </w:p>
+        </w:tc>
+        <w:tc>
+          <w:tcPr>
+            <w:tcW w:w="1108" w:type="dxa"/>
+          </w:tcPr>
+          <w:p>
+            <w:pPr>
+              <w:pStyle w:val="Compact"/>
+              <w:spacing w:before="0" w:after="0" w:line="240" w:lineRule="auto"/>
+              <w:jc w:val="right"/>
+            </w:pPr>
+            <w:r>
+              <w:t xml:space="preserve">0.65 (0.44-0.83)</w:t>
+            </w:r>
+          </w:p>
+        </w:tc>
+        <w:tc>
+          <w:tcPr>
+            <w:tcW w:w="1108" w:type="dxa"/>
+          </w:tcPr>
+          <w:p>
+            <w:pPr>
+              <w:pStyle w:val="Compact"/>
+              <w:spacing w:before="0" w:after="0" w:line="240" w:lineRule="auto"/>
+              <w:jc w:val="right"/>
+            </w:pPr>
+            <w:r>
+              <w:t xml:space="preserve">0.94 (0.78-1.00)</w:t>
+            </w:r>
+          </w:p>
+        </w:tc>
+        <w:tc>
+          <w:tcPr>
+            <w:tcW w:w="1108" w:type="dxa"/>
+          </w:tcPr>
+          <w:p>
+            <w:pPr>
+              <w:pStyle w:val="Compact"/>
+              <w:spacing w:before="0" w:after="0" w:line="240" w:lineRule="auto"/>
+              <w:jc w:val="right"/>
+            </w:pPr>
+            <w:r>
+              <w:t xml:space="preserve">0.77 (0.59-0.89)</w:t>
+            </w:r>
+          </w:p>
         </w:tc>
       </w:tr>
     </w:tbl>
@@ -8344,7 +9081,7 @@
       <w:tr>
         <w:tc>
           <w:tcPr/>
-          <w:bookmarkStart w:id="133" w:name="tbl-uncertainty-task-results"/>
+          <w:bookmarkStart w:id="157" w:name="tbl-uncertainty-task-results"/>
           <w:p>
             <w:pPr>
               <w:pStyle w:val="ImageCaption"/>
@@ -9816,7 +10553,7 @@
               </w:tc>
             </w:tr>
           </w:tbl>
-          <w:bookmarkEnd w:id="133"/>
+          <w:bookmarkEnd w:id="157"/>
           <w:p/>
         </w:tc>
       </w:tr>
@@ -9839,19 +10576,9 @@
         <w:t xml:space="preserve">IoU = intersection over union for matched span boundaries; F1 = harmonic mean of precision and recall.</w:t>
       </w:r>
     </w:p>
-    <w:p>
-      <w:pPr>
-        <w:sectPr>
-          <w:pgSz w:h="11906" w:w="16838" w:orient="landscape"/>
-          <w:pgMar w:top="1440" w:right="1440" w:bottom="1440" w:left="1440" w:header="720" w:footer="720" w:gutter="0"/>
-          <w:cols w:space="720"/>
-        </w:sectPr>
-      </w:pPr>
-      <w:bookmarkEnd w:id="134"/>
-    </w:p>
     <w:sectPr>
-      <w:pgSz w:h="15840" w:w="12240"/>
-      <w:pgMar w:bottom="1440" w:footer="720" w:gutter="0" w:header="720" w:left="1440" w:right="1440" w:top="1440"/>
+      <w:pgSz w:h="11906" w:w="16838" w:orient="landscape"/>
+      <w:pgMar w:top="1440" w:right="1440" w:bottom="1440" w:left="1440" w:header="720" w:footer="720" w:gutter="0"/>
       <w:cols w:space="720"/>
     </w:sectPr>
   </w:body>

</xml_diff>